<commit_message>
docs(deliveries): add software deliveries view documentation, retina screenshots, and update docx suite
</commit_message>
<xml_diff>
--- a/docs/ProjectPulse_Product_Capabilities_Manual.docx
+++ b/docs/ProjectPulse_Product_Capabilities_Manual.docx
@@ -225,7 +225,7 @@
                 <w:color w:val="1C1C1E"/>
                 <w:sz w:val="19"/>
               </w:rPr>
-              <w:t>12 August 2026</w:t>
+              <w:t>08 September 2026</w:t>
             </w:r>
           </w:p>
         </w:tc>
@@ -432,7 +432,7 @@
               <w:rPr>
                 <w:sz w:val="21"/>
               </w:rPr>
-              <w:t>Hierarchical Delivery Matrix</w:t>
+              <w:t>Software Deliveries &amp; Deployment Schedule</w:t>
             </w:r>
           </w:p>
         </w:tc>
@@ -482,7 +482,7 @@
               <w:rPr>
                 <w:sz w:val="21"/>
               </w:rPr>
-              <w:t>Gantt Timeline &amp; Dependency Management</w:t>
+              <w:t>Hierarchical Task Matrix &amp; Work Breakdown Structure</w:t>
             </w:r>
           </w:p>
         </w:tc>
@@ -500,7 +500,7 @@
                 <w:color w:val="6C757D"/>
                 <w:sz w:val="20"/>
               </w:rPr>
-              <w:t>22</w:t>
+              <w:t>21</w:t>
             </w:r>
           </w:p>
         </w:tc>
@@ -532,7 +532,7 @@
               <w:rPr>
                 <w:sz w:val="21"/>
               </w:rPr>
-              <w:t>Intelligent Weekly Scheduler &amp; Conflict Resolver</w:t>
+              <w:t>Gantt Timeline &amp; Dependency Management</w:t>
             </w:r>
           </w:p>
         </w:tc>
@@ -582,7 +582,7 @@
               <w:rPr>
                 <w:sz w:val="21"/>
               </w:rPr>
-              <w:t>Unified RAID Register</w:t>
+              <w:t>Intelligent Weekly Scheduler &amp; Conflict Resolver</w:t>
             </w:r>
           </w:p>
         </w:tc>
@@ -600,7 +600,7 @@
                 <w:color w:val="6C757D"/>
                 <w:sz w:val="20"/>
               </w:rPr>
-              <w:t>35</w:t>
+              <w:t>34</w:t>
             </w:r>
           </w:p>
         </w:tc>
@@ -632,7 +632,7 @@
               <w:rPr>
                 <w:sz w:val="21"/>
               </w:rPr>
-              <w:t>Team Capacity Hub &amp; Role Management</w:t>
+              <w:t>Unified RAID Register</w:t>
             </w:r>
           </w:p>
         </w:tc>
@@ -682,7 +682,7 @@
               <w:rPr>
                 <w:sz w:val="21"/>
               </w:rPr>
-              <w:t>Defect Tracker &amp; Bug Lifecycle</w:t>
+              <w:t>Team Capacity Hub &amp; Role Management</w:t>
             </w:r>
           </w:p>
         </w:tc>
@@ -700,7 +700,7 @@
                 <w:color w:val="6C757D"/>
                 <w:sz w:val="20"/>
               </w:rPr>
-              <w:t>46</w:t>
+              <w:t>47</w:t>
             </w:r>
           </w:p>
         </w:tc>
@@ -732,7 +732,7 @@
               <w:rPr>
                 <w:sz w:val="21"/>
               </w:rPr>
-              <w:t>Reports &amp; Stakeholder Board Packs</w:t>
+              <w:t>Defect Tracker &amp; Bug Lifecycle</w:t>
             </w:r>
           </w:p>
         </w:tc>
@@ -782,7 +782,7 @@
               <w:rPr>
                 <w:sz w:val="21"/>
               </w:rPr>
-              <w:t>Audit Log &amp; Activity Streams</w:t>
+              <w:t>Reports &amp; Stakeholder Board Packs</w:t>
             </w:r>
           </w:p>
         </w:tc>
@@ -800,7 +800,7 @@
                 <w:color w:val="6C757D"/>
                 <w:sz w:val="20"/>
               </w:rPr>
-              <w:t>56</w:t>
+              <w:t>58</w:t>
             </w:r>
           </w:p>
         </w:tc>
@@ -832,7 +832,7 @@
               <w:rPr>
                 <w:sz w:val="21"/>
               </w:rPr>
-              <w:t>Schedule Baselines &amp; Snapshot History</w:t>
+              <w:t>Audit Log &amp; Activity Streams</w:t>
             </w:r>
           </w:p>
         </w:tc>
@@ -850,7 +850,7 @@
                 <w:color w:val="6C757D"/>
                 <w:sz w:val="20"/>
               </w:rPr>
-              <w:t>60</w:t>
+              <w:t>62</w:t>
             </w:r>
           </w:p>
         </w:tc>
@@ -882,7 +882,7 @@
               <w:rPr>
                 <w:sz w:val="21"/>
               </w:rPr>
-              <w:t>System Configuration Reference</w:t>
+              <w:t>Schedule Baselines &amp; Snapshot History</w:t>
             </w:r>
           </w:p>
         </w:tc>
@@ -900,7 +900,7 @@
                 <w:color w:val="6C757D"/>
                 <w:sz w:val="20"/>
               </w:rPr>
-              <w:t>65</w:t>
+              <w:t>66</w:t>
             </w:r>
           </w:p>
         </w:tc>
@@ -918,7 +918,7 @@
                 <w:color w:val="00C2A8"/>
                 <w:sz w:val="20"/>
               </w:rPr>
-              <w:t>A</w:t>
+              <w:t>13</w:t>
             </w:r>
           </w:p>
         </w:tc>
@@ -932,7 +932,7 @@
               <w:rPr>
                 <w:sz w:val="21"/>
               </w:rPr>
-              <w:t>Appendix A — Keyboard Shortcuts</w:t>
+              <w:t>System Configuration Reference</w:t>
             </w:r>
           </w:p>
         </w:tc>
@@ -950,7 +950,7 @@
                 <w:color w:val="6C757D"/>
                 <w:sz w:val="20"/>
               </w:rPr>
-              <w:t>70</w:t>
+              <w:t>71</w:t>
             </w:r>
           </w:p>
         </w:tc>
@@ -968,7 +968,7 @@
                 <w:color w:val="00C2A8"/>
                 <w:sz w:val="20"/>
               </w:rPr>
-              <w:t>B</w:t>
+              <w:t>A</w:t>
             </w:r>
           </w:p>
         </w:tc>
@@ -982,7 +982,7 @@
               <w:rPr>
                 <w:sz w:val="21"/>
               </w:rPr>
-              <w:t>Appendix B — Data Schema Reference</w:t>
+              <w:t>Appendix A — Keyboard Shortcuts</w:t>
             </w:r>
           </w:p>
         </w:tc>
@@ -1000,7 +1000,57 @@
                 <w:color w:val="6C757D"/>
                 <w:sz w:val="20"/>
               </w:rPr>
-              <w:t>72</w:t>
+              <w:t>76</w:t>
+            </w:r>
+          </w:p>
+        </w:tc>
+      </w:tr>
+      <w:tr>
+        <w:tc>
+          <w:tcPr>
+            <w:tcW w:type="dxa" w:w="576"/>
+            <w:shd w:val="clear" w:color="auto" w:fill="F4F7FA"/>
+          </w:tcPr>
+          <w:p>
+            <w:r>
+              <w:rPr>
+                <w:b/>
+                <w:color w:val="00C2A8"/>
+                <w:sz w:val="20"/>
+              </w:rPr>
+              <w:t>B</w:t>
+            </w:r>
+          </w:p>
+        </w:tc>
+        <w:tc>
+          <w:tcPr>
+            <w:tcW w:type="dxa" w:w="7776"/>
+            <w:shd w:val="clear" w:color="auto" w:fill="F4F7FA"/>
+          </w:tcPr>
+          <w:p>
+            <w:r>
+              <w:rPr>
+                <w:sz w:val="21"/>
+              </w:rPr>
+              <w:t>Appendix B — Data Schema Reference</w:t>
+            </w:r>
+          </w:p>
+        </w:tc>
+        <w:tc>
+          <w:tcPr>
+            <w:tcW w:type="dxa" w:w="864"/>
+            <w:shd w:val="clear" w:color="auto" w:fill="F4F7FA"/>
+          </w:tcPr>
+          <w:p>
+            <w:pPr>
+              <w:jc w:val="right"/>
+            </w:pPr>
+            <w:r>
+              <w:rPr>
+                <w:color w:val="6C757D"/>
+                <w:sz w:val="20"/>
+              </w:rPr>
+              <w:t>78</w:t>
             </w:r>
           </w:p>
         </w:tc>
@@ -2522,7 +2572,7 @@
                 <w:color w:val="1C1C1E"/>
                 <w:sz w:val="19"/>
               </w:rPr>
-              <w:t>Always capture a Schedule Baseline (Chapter 11) before committing sandbox changes. This ensures you can restore the original plan if the simulation produces undesirable outcomes.</w:t>
+              <w:t>Always capture a Schedule Baseline (Chapter 12) before committing sandbox changes. This ensures you can restore the original plan if the simulation produces undesirable outcomes.</w:t>
             </w:r>
           </w:p>
         </w:tc>
@@ -3587,7 +3637,7 @@
           <w:rFonts w:ascii="Segoe UI" w:hAnsi="Segoe UI"/>
           <w:color w:val="0D1B2A"/>
         </w:rPr>
-        <w:t>3  Hierarchical Delivery Matrix</w:t>
+        <w:t>3  Software Deliveries &amp; Deployment Schedule</w:t>
       </w:r>
     </w:p>
     <w:p>
@@ -3607,7 +3657,7 @@
           <w:rFonts w:ascii="Segoe UI" w:hAnsi="Segoe UI"/>
           <w:sz w:val="21"/>
         </w:rPr>
-        <w:t>The Delivery Matrix is the operational backbone of ProjectPulse — a high-density, spreadsheet-style task grid that supports multi-level parent-child hierarchies, inline editing, dependency mapping, effort estimation, and real-time status tracking. Every deliverable, epic, task, and subtask in the project lives in this view.</w:t>
+        <w:t>The Software Deliveries workstation (View 3: 'deliveries') is ProjectPulse's dedicated command center for tracking formal software delivery milestones, ALM/PDN tracking, deployment schedules, and build releases. It bridges the gap between low-level WBS tasks and production releases, providing project managers, release coordinators, and DevOps leads with end-to-end visibility from code completion to production rollout.</w:t>
       </w:r>
     </w:p>
     <w:tbl>
@@ -3648,7 +3698,7 @@
                     <a:graphicData uri="http://schemas.openxmlformats.org/drawingml/2006/picture">
                       <pic:pic>
                         <pic:nvPicPr>
-                          <pic:cNvPr id="0" name="02_delivery_matrix.png"/>
+                          <pic:cNvPr id="0" name="02b_software_deliveries.png"/>
                           <pic:cNvPicPr/>
                         </pic:nvPicPr>
                         <pic:blipFill>
@@ -3686,7 +3736,7 @@
           <w:color w:val="6C757D"/>
           <w:sz w:val="18"/>
         </w:rPr>
-        <w:t>Figure 3.1 — Hierarchical Delivery Matrix showing parent tasks, child subtasks, status pills, and inline controls</w:t>
+        <w:t>Figure 3.1 — Software Deliveries View: High-density table grid with status pills, ALM/PDN tracking, and quick filters</w:t>
       </w:r>
     </w:p>
     <w:p>
@@ -3700,7 +3750,3094 @@
           <w:rFonts w:ascii="Segoe UI" w:hAnsi="Segoe UI"/>
           <w:color w:val="1E9ED5"/>
         </w:rPr>
-        <w:t>3.1  Parent-Child Task Hierarchies</w:t>
+        <w:t>3.1  Delivery Record Architecture &amp; ALM / PDN Tracking</w:t>
+      </w:r>
+    </w:p>
+    <w:p>
+      <w:pPr>
+        <w:spacing w:before="0" w:after="120"/>
+      </w:pPr>
+      <w:r>
+        <w:rPr>
+          <w:rFonts w:ascii="Segoe UI" w:hAnsi="Segoe UI"/>
+          <w:sz w:val="21"/>
+        </w:rPr>
+        <w:t>Every delivery record in ProjectPulse (P.deliveries) is structured to support enterprise-grade release management and compliance traceability:</w:t>
+      </w:r>
+    </w:p>
+    <w:tbl>
+      <w:tblPr>
+        <w:tblW w:type="auto" w:w="0"/>
+        <w:jc w:val="center"/>
+        <w:tblLook w:firstColumn="1" w:firstRow="1" w:lastColumn="0" w:lastRow="0" w:noHBand="0" w:noVBand="1" w:val="04A0"/>
+      </w:tblPr>
+      <w:tblGrid>
+        <w:gridCol w:w="2340"/>
+        <w:gridCol w:w="2340"/>
+        <w:gridCol w:w="2340"/>
+        <w:gridCol w:w="2340"/>
+      </w:tblGrid>
+      <w:tr>
+        <w:tc>
+          <w:tcPr>
+            <w:tcW w:type="dxa" w:w="1872"/>
+            <w:shd w:val="clear" w:color="auto" w:fill="0D1B2A"/>
+            <w:tcMar>
+              <w:top w:w="120" w:type="dxa"/>
+              <w:bottom w:w="120" w:type="dxa"/>
+              <w:left w:w="180" w:type="dxa"/>
+              <w:right w:w="180" w:type="dxa"/>
+            </w:tcMar>
+            <w:tcBorders>
+              <w:top w:val="none"/>
+              <w:bottom w:val="single" w:sz="12" w:color="00C2A8"/>
+              <w:left w:val="none"/>
+              <w:right w:val="none"/>
+            </w:tcBorders>
+          </w:tcPr>
+          <w:p>
+            <w:pPr>
+              <w:spacing w:before="40" w:after="40"/>
+              <w:jc w:val="left"/>
+            </w:pPr>
+            <w:r>
+              <w:rPr>
+                <w:rFonts w:ascii="Segoe UI" w:hAnsi="Segoe UI"/>
+                <w:b/>
+                <w:color w:val="FFFFFF"/>
+                <w:sz w:val="19"/>
+              </w:rPr>
+              <w:t>Field</w:t>
+            </w:r>
+          </w:p>
+        </w:tc>
+        <w:tc>
+          <w:tcPr>
+            <w:tcW w:type="dxa" w:w="1728"/>
+            <w:shd w:val="clear" w:color="auto" w:fill="0D1B2A"/>
+            <w:tcMar>
+              <w:top w:w="120" w:type="dxa"/>
+              <w:bottom w:w="120" w:type="dxa"/>
+              <w:left w:w="180" w:type="dxa"/>
+              <w:right w:w="180" w:type="dxa"/>
+            </w:tcMar>
+            <w:tcBorders>
+              <w:top w:val="none"/>
+              <w:bottom w:val="single" w:sz="12" w:color="00C2A8"/>
+              <w:left w:val="none"/>
+              <w:right w:val="none"/>
+            </w:tcBorders>
+          </w:tcPr>
+          <w:p>
+            <w:pPr>
+              <w:spacing w:before="40" w:after="40"/>
+              <w:jc w:val="left"/>
+            </w:pPr>
+            <w:r>
+              <w:rPr>
+                <w:rFonts w:ascii="Segoe UI" w:hAnsi="Segoe UI"/>
+                <w:b/>
+                <w:color w:val="FFFFFF"/>
+                <w:sz w:val="19"/>
+              </w:rPr>
+              <w:t>Type</w:t>
+            </w:r>
+          </w:p>
+        </w:tc>
+        <w:tc>
+          <w:tcPr>
+            <w:tcW w:type="dxa" w:w="3600"/>
+            <w:shd w:val="clear" w:color="auto" w:fill="0D1B2A"/>
+            <w:tcMar>
+              <w:top w:w="120" w:type="dxa"/>
+              <w:bottom w:w="120" w:type="dxa"/>
+              <w:left w:w="180" w:type="dxa"/>
+              <w:right w:w="180" w:type="dxa"/>
+            </w:tcMar>
+            <w:tcBorders>
+              <w:top w:val="none"/>
+              <w:bottom w:val="single" w:sz="12" w:color="00C2A8"/>
+              <w:left w:val="none"/>
+              <w:right w:val="none"/>
+            </w:tcBorders>
+          </w:tcPr>
+          <w:p>
+            <w:pPr>
+              <w:spacing w:before="40" w:after="40"/>
+              <w:jc w:val="left"/>
+            </w:pPr>
+            <w:r>
+              <w:rPr>
+                <w:rFonts w:ascii="Segoe UI" w:hAnsi="Segoe UI"/>
+                <w:b/>
+                <w:color w:val="FFFFFF"/>
+                <w:sz w:val="19"/>
+              </w:rPr>
+              <w:t>Description</w:t>
+            </w:r>
+          </w:p>
+        </w:tc>
+        <w:tc>
+          <w:tcPr>
+            <w:tcW w:type="dxa" w:w="2304"/>
+            <w:shd w:val="clear" w:color="auto" w:fill="0D1B2A"/>
+            <w:tcMar>
+              <w:top w:w="120" w:type="dxa"/>
+              <w:bottom w:w="120" w:type="dxa"/>
+              <w:left w:w="180" w:type="dxa"/>
+              <w:right w:w="180" w:type="dxa"/>
+            </w:tcMar>
+            <w:tcBorders>
+              <w:top w:val="none"/>
+              <w:bottom w:val="single" w:sz="12" w:color="00C2A8"/>
+              <w:left w:val="none"/>
+              <w:right w:val="none"/>
+            </w:tcBorders>
+          </w:tcPr>
+          <w:p>
+            <w:pPr>
+              <w:spacing w:before="40" w:after="40"/>
+              <w:jc w:val="left"/>
+            </w:pPr>
+            <w:r>
+              <w:rPr>
+                <w:rFonts w:ascii="Segoe UI" w:hAnsi="Segoe UI"/>
+                <w:b/>
+                <w:color w:val="FFFFFF"/>
+                <w:sz w:val="19"/>
+              </w:rPr>
+              <w:t>Business Value</w:t>
+            </w:r>
+          </w:p>
+        </w:tc>
+      </w:tr>
+      <w:tr>
+        <w:tc>
+          <w:tcPr>
+            <w:tcW w:type="dxa" w:w="1872"/>
+            <w:shd w:val="clear" w:color="auto" w:fill="F8FAFC"/>
+            <w:tcMar>
+              <w:top w:w="100" w:type="dxa"/>
+              <w:bottom w:w="100" w:type="dxa"/>
+              <w:left w:w="150" w:type="dxa"/>
+              <w:right w:w="150" w:type="dxa"/>
+            </w:tcMar>
+            <w:tcBorders>
+              <w:top w:val="none"/>
+              <w:bottom w:val="single" w:sz="4" w:color="E2E8F0"/>
+              <w:left w:val="none"/>
+              <w:right w:val="none"/>
+            </w:tcBorders>
+          </w:tcPr>
+          <w:p>
+            <w:pPr>
+              <w:spacing w:before="40" w:after="40"/>
+              <w:jc w:val="left"/>
+            </w:pPr>
+            <w:r>
+              <w:rPr>
+                <w:rFonts w:ascii="Segoe UI" w:hAnsi="Segoe UI"/>
+                <w:color w:val="1C1C1E"/>
+                <w:sz w:val="19"/>
+              </w:rPr>
+              <w:t>id</w:t>
+            </w:r>
+          </w:p>
+        </w:tc>
+        <w:tc>
+          <w:tcPr>
+            <w:tcW w:type="dxa" w:w="1728"/>
+            <w:shd w:val="clear" w:color="auto" w:fill="F8FAFC"/>
+            <w:tcMar>
+              <w:top w:w="100" w:type="dxa"/>
+              <w:bottom w:w="100" w:type="dxa"/>
+              <w:left w:w="150" w:type="dxa"/>
+              <w:right w:w="150" w:type="dxa"/>
+            </w:tcMar>
+            <w:tcBorders>
+              <w:top w:val="none"/>
+              <w:bottom w:val="single" w:sz="4" w:color="E2E8F0"/>
+              <w:left w:val="none"/>
+              <w:right w:val="none"/>
+            </w:tcBorders>
+          </w:tcPr>
+          <w:p>
+            <w:pPr>
+              <w:spacing w:before="40" w:after="40"/>
+              <w:jc w:val="left"/>
+            </w:pPr>
+            <w:r>
+              <w:rPr>
+                <w:rFonts w:ascii="Segoe UI" w:hAnsi="Segoe UI"/>
+                <w:color w:val="1C1C1E"/>
+                <w:sz w:val="19"/>
+              </w:rPr>
+              <w:t>String (Unique)</w:t>
+            </w:r>
+          </w:p>
+        </w:tc>
+        <w:tc>
+          <w:tcPr>
+            <w:tcW w:type="dxa" w:w="3600"/>
+            <w:shd w:val="clear" w:color="auto" w:fill="F8FAFC"/>
+            <w:tcMar>
+              <w:top w:w="100" w:type="dxa"/>
+              <w:bottom w:w="100" w:type="dxa"/>
+              <w:left w:w="150" w:type="dxa"/>
+              <w:right w:w="150" w:type="dxa"/>
+            </w:tcMar>
+            <w:tcBorders>
+              <w:top w:val="none"/>
+              <w:bottom w:val="single" w:sz="4" w:color="E2E8F0"/>
+              <w:left w:val="none"/>
+              <w:right w:val="none"/>
+            </w:tcBorders>
+          </w:tcPr>
+          <w:p>
+            <w:pPr>
+              <w:spacing w:before="40" w:after="40"/>
+              <w:jc w:val="left"/>
+            </w:pPr>
+            <w:r>
+              <w:rPr>
+                <w:rFonts w:ascii="Segoe UI" w:hAnsi="Segoe UI"/>
+                <w:color w:val="1C1C1E"/>
+                <w:sz w:val="19"/>
+              </w:rPr>
+              <w:t>Permanent delivery identifier (e.g. DEL-001, DEL-002)</w:t>
+            </w:r>
+          </w:p>
+        </w:tc>
+        <w:tc>
+          <w:tcPr>
+            <w:tcW w:type="dxa" w:w="2304"/>
+            <w:shd w:val="clear" w:color="auto" w:fill="F8FAFC"/>
+            <w:tcMar>
+              <w:top w:w="100" w:type="dxa"/>
+              <w:bottom w:w="100" w:type="dxa"/>
+              <w:left w:w="150" w:type="dxa"/>
+              <w:right w:w="150" w:type="dxa"/>
+            </w:tcMar>
+            <w:tcBorders>
+              <w:top w:val="none"/>
+              <w:bottom w:val="single" w:sz="4" w:color="E2E8F0"/>
+              <w:left w:val="none"/>
+              <w:right w:val="none"/>
+            </w:tcBorders>
+          </w:tcPr>
+          <w:p>
+            <w:pPr>
+              <w:spacing w:before="40" w:after="40"/>
+              <w:jc w:val="left"/>
+            </w:pPr>
+            <w:r>
+              <w:rPr>
+                <w:rFonts w:ascii="Segoe UI" w:hAnsi="Segoe UI"/>
+                <w:color w:val="1C1C1E"/>
+                <w:sz w:val="19"/>
+              </w:rPr>
+              <w:t>Unique reference across audit logs, reports, and change requests.</w:t>
+            </w:r>
+          </w:p>
+        </w:tc>
+      </w:tr>
+      <w:tr>
+        <w:tc>
+          <w:tcPr>
+            <w:tcW w:type="dxa" w:w="1872"/>
+            <w:shd w:val="clear" w:color="auto" w:fill="FFFFFF"/>
+            <w:tcMar>
+              <w:top w:w="100" w:type="dxa"/>
+              <w:bottom w:w="100" w:type="dxa"/>
+              <w:left w:w="150" w:type="dxa"/>
+              <w:right w:w="150" w:type="dxa"/>
+            </w:tcMar>
+            <w:tcBorders>
+              <w:top w:val="none"/>
+              <w:bottom w:val="single" w:sz="4" w:color="E2E8F0"/>
+              <w:left w:val="none"/>
+              <w:right w:val="none"/>
+            </w:tcBorders>
+          </w:tcPr>
+          <w:p>
+            <w:pPr>
+              <w:spacing w:before="40" w:after="40"/>
+              <w:jc w:val="left"/>
+            </w:pPr>
+            <w:r>
+              <w:rPr>
+                <w:rFonts w:ascii="Segoe UI" w:hAnsi="Segoe UI"/>
+                <w:color w:val="1C1C1E"/>
+                <w:sz w:val="19"/>
+              </w:rPr>
+              <w:t>title</w:t>
+            </w:r>
+          </w:p>
+        </w:tc>
+        <w:tc>
+          <w:tcPr>
+            <w:tcW w:type="dxa" w:w="1728"/>
+            <w:shd w:val="clear" w:color="auto" w:fill="FFFFFF"/>
+            <w:tcMar>
+              <w:top w:w="100" w:type="dxa"/>
+              <w:bottom w:w="100" w:type="dxa"/>
+              <w:left w:w="150" w:type="dxa"/>
+              <w:right w:w="150" w:type="dxa"/>
+            </w:tcMar>
+            <w:tcBorders>
+              <w:top w:val="none"/>
+              <w:bottom w:val="single" w:sz="4" w:color="E2E8F0"/>
+              <w:left w:val="none"/>
+              <w:right w:val="none"/>
+            </w:tcBorders>
+          </w:tcPr>
+          <w:p>
+            <w:pPr>
+              <w:spacing w:before="40" w:after="40"/>
+              <w:jc w:val="left"/>
+            </w:pPr>
+            <w:r>
+              <w:rPr>
+                <w:rFonts w:ascii="Segoe UI" w:hAnsi="Segoe UI"/>
+                <w:color w:val="1C1C1E"/>
+                <w:sz w:val="19"/>
+              </w:rPr>
+              <w:t>String</w:t>
+            </w:r>
+          </w:p>
+        </w:tc>
+        <w:tc>
+          <w:tcPr>
+            <w:tcW w:type="dxa" w:w="3600"/>
+            <w:shd w:val="clear" w:color="auto" w:fill="FFFFFF"/>
+            <w:tcMar>
+              <w:top w:w="100" w:type="dxa"/>
+              <w:bottom w:w="100" w:type="dxa"/>
+              <w:left w:w="150" w:type="dxa"/>
+              <w:right w:w="150" w:type="dxa"/>
+            </w:tcMar>
+            <w:tcBorders>
+              <w:top w:val="none"/>
+              <w:bottom w:val="single" w:sz="4" w:color="E2E8F0"/>
+              <w:left w:val="none"/>
+              <w:right w:val="none"/>
+            </w:tcBorders>
+          </w:tcPr>
+          <w:p>
+            <w:pPr>
+              <w:spacing w:before="40" w:after="40"/>
+              <w:jc w:val="left"/>
+            </w:pPr>
+            <w:r>
+              <w:rPr>
+                <w:rFonts w:ascii="Segoe UI" w:hAnsi="Segoe UI"/>
+                <w:color w:val="1C1C1E"/>
+                <w:sz w:val="19"/>
+              </w:rPr>
+              <w:t>Descriptive name of the delivery package or milestone</w:t>
+            </w:r>
+          </w:p>
+        </w:tc>
+        <w:tc>
+          <w:tcPr>
+            <w:tcW w:type="dxa" w:w="2304"/>
+            <w:shd w:val="clear" w:color="auto" w:fill="FFFFFF"/>
+            <w:tcMar>
+              <w:top w:w="100" w:type="dxa"/>
+              <w:bottom w:w="100" w:type="dxa"/>
+              <w:left w:w="150" w:type="dxa"/>
+              <w:right w:w="150" w:type="dxa"/>
+            </w:tcMar>
+            <w:tcBorders>
+              <w:top w:val="none"/>
+              <w:bottom w:val="single" w:sz="4" w:color="E2E8F0"/>
+              <w:left w:val="none"/>
+              <w:right w:val="none"/>
+            </w:tcBorders>
+          </w:tcPr>
+          <w:p>
+            <w:pPr>
+              <w:spacing w:before="40" w:after="40"/>
+              <w:jc w:val="left"/>
+            </w:pPr>
+            <w:r>
+              <w:rPr>
+                <w:rFonts w:ascii="Segoe UI" w:hAnsi="Segoe UI"/>
+                <w:color w:val="1C1C1E"/>
+                <w:sz w:val="19"/>
+              </w:rPr>
+              <w:t>Clear business context for executive and engineering stakeholders.</w:t>
+            </w:r>
+          </w:p>
+        </w:tc>
+      </w:tr>
+      <w:tr>
+        <w:tc>
+          <w:tcPr>
+            <w:tcW w:type="dxa" w:w="1872"/>
+            <w:shd w:val="clear" w:color="auto" w:fill="F8FAFC"/>
+            <w:tcMar>
+              <w:top w:w="100" w:type="dxa"/>
+              <w:bottom w:w="100" w:type="dxa"/>
+              <w:left w:w="150" w:type="dxa"/>
+              <w:right w:w="150" w:type="dxa"/>
+            </w:tcMar>
+            <w:tcBorders>
+              <w:top w:val="none"/>
+              <w:bottom w:val="single" w:sz="4" w:color="E2E8F0"/>
+              <w:left w:val="none"/>
+              <w:right w:val="none"/>
+            </w:tcBorders>
+          </w:tcPr>
+          <w:p>
+            <w:pPr>
+              <w:spacing w:before="40" w:after="40"/>
+              <w:jc w:val="left"/>
+            </w:pPr>
+            <w:r>
+              <w:rPr>
+                <w:rFonts w:ascii="Segoe UI" w:hAnsi="Segoe UI"/>
+                <w:color w:val="1C1C1E"/>
+                <w:sz w:val="19"/>
+              </w:rPr>
+              <w:t>version</w:t>
+            </w:r>
+          </w:p>
+        </w:tc>
+        <w:tc>
+          <w:tcPr>
+            <w:tcW w:type="dxa" w:w="1728"/>
+            <w:shd w:val="clear" w:color="auto" w:fill="F8FAFC"/>
+            <w:tcMar>
+              <w:top w:w="100" w:type="dxa"/>
+              <w:bottom w:w="100" w:type="dxa"/>
+              <w:left w:w="150" w:type="dxa"/>
+              <w:right w:w="150" w:type="dxa"/>
+            </w:tcMar>
+            <w:tcBorders>
+              <w:top w:val="none"/>
+              <w:bottom w:val="single" w:sz="4" w:color="E2E8F0"/>
+              <w:left w:val="none"/>
+              <w:right w:val="none"/>
+            </w:tcBorders>
+          </w:tcPr>
+          <w:p>
+            <w:pPr>
+              <w:spacing w:before="40" w:after="40"/>
+              <w:jc w:val="left"/>
+            </w:pPr>
+            <w:r>
+              <w:rPr>
+                <w:rFonts w:ascii="Segoe UI" w:hAnsi="Segoe UI"/>
+                <w:color w:val="1C1C1E"/>
+                <w:sz w:val="19"/>
+              </w:rPr>
+              <w:t>String</w:t>
+            </w:r>
+          </w:p>
+        </w:tc>
+        <w:tc>
+          <w:tcPr>
+            <w:tcW w:type="dxa" w:w="3600"/>
+            <w:shd w:val="clear" w:color="auto" w:fill="F8FAFC"/>
+            <w:tcMar>
+              <w:top w:w="100" w:type="dxa"/>
+              <w:bottom w:w="100" w:type="dxa"/>
+              <w:left w:w="150" w:type="dxa"/>
+              <w:right w:w="150" w:type="dxa"/>
+            </w:tcMar>
+            <w:tcBorders>
+              <w:top w:val="none"/>
+              <w:bottom w:val="single" w:sz="4" w:color="E2E8F0"/>
+              <w:left w:val="none"/>
+              <w:right w:val="none"/>
+            </w:tcBorders>
+          </w:tcPr>
+          <w:p>
+            <w:pPr>
+              <w:spacing w:before="40" w:after="40"/>
+              <w:jc w:val="left"/>
+            </w:pPr>
+            <w:r>
+              <w:rPr>
+                <w:rFonts w:ascii="Segoe UI" w:hAnsi="Segoe UI"/>
+                <w:color w:val="1C1C1E"/>
+                <w:sz w:val="19"/>
+              </w:rPr>
+              <w:t>Semantic or build version tag (e.g., v2.1.0-RC1)</w:t>
+            </w:r>
+          </w:p>
+        </w:tc>
+        <w:tc>
+          <w:tcPr>
+            <w:tcW w:type="dxa" w:w="2304"/>
+            <w:shd w:val="clear" w:color="auto" w:fill="F8FAFC"/>
+            <w:tcMar>
+              <w:top w:w="100" w:type="dxa"/>
+              <w:bottom w:w="100" w:type="dxa"/>
+              <w:left w:w="150" w:type="dxa"/>
+              <w:right w:w="150" w:type="dxa"/>
+            </w:tcMar>
+            <w:tcBorders>
+              <w:top w:val="none"/>
+              <w:bottom w:val="single" w:sz="4" w:color="E2E8F0"/>
+              <w:left w:val="none"/>
+              <w:right w:val="none"/>
+            </w:tcBorders>
+          </w:tcPr>
+          <w:p>
+            <w:pPr>
+              <w:spacing w:before="40" w:after="40"/>
+              <w:jc w:val="left"/>
+            </w:pPr>
+            <w:r>
+              <w:rPr>
+                <w:rFonts w:ascii="Segoe UI" w:hAnsi="Segoe UI"/>
+                <w:color w:val="1C1C1E"/>
+                <w:sz w:val="19"/>
+              </w:rPr>
+              <w:t>Synchronised with git tags and CI/CD pipeline build artefacts.</w:t>
+            </w:r>
+          </w:p>
+        </w:tc>
+      </w:tr>
+      <w:tr>
+        <w:tc>
+          <w:tcPr>
+            <w:tcW w:type="dxa" w:w="1872"/>
+            <w:shd w:val="clear" w:color="auto" w:fill="FFFFFF"/>
+            <w:tcMar>
+              <w:top w:w="100" w:type="dxa"/>
+              <w:bottom w:w="100" w:type="dxa"/>
+              <w:left w:w="150" w:type="dxa"/>
+              <w:right w:w="150" w:type="dxa"/>
+            </w:tcMar>
+            <w:tcBorders>
+              <w:top w:val="none"/>
+              <w:bottom w:val="single" w:sz="4" w:color="E2E8F0"/>
+              <w:left w:val="none"/>
+              <w:right w:val="none"/>
+            </w:tcBorders>
+          </w:tcPr>
+          <w:p>
+            <w:pPr>
+              <w:spacing w:before="40" w:after="40"/>
+              <w:jc w:val="left"/>
+            </w:pPr>
+            <w:r>
+              <w:rPr>
+                <w:rFonts w:ascii="Segoe UI" w:hAnsi="Segoe UI"/>
+                <w:color w:val="1C1C1E"/>
+                <w:sz w:val="19"/>
+              </w:rPr>
+              <w:t>type</w:t>
+            </w:r>
+          </w:p>
+        </w:tc>
+        <w:tc>
+          <w:tcPr>
+            <w:tcW w:type="dxa" w:w="1728"/>
+            <w:shd w:val="clear" w:color="auto" w:fill="FFFFFF"/>
+            <w:tcMar>
+              <w:top w:w="100" w:type="dxa"/>
+              <w:bottom w:w="100" w:type="dxa"/>
+              <w:left w:w="150" w:type="dxa"/>
+              <w:right w:w="150" w:type="dxa"/>
+            </w:tcMar>
+            <w:tcBorders>
+              <w:top w:val="none"/>
+              <w:bottom w:val="single" w:sz="4" w:color="E2E8F0"/>
+              <w:left w:val="none"/>
+              <w:right w:val="none"/>
+            </w:tcBorders>
+          </w:tcPr>
+          <w:p>
+            <w:pPr>
+              <w:spacing w:before="40" w:after="40"/>
+              <w:jc w:val="left"/>
+            </w:pPr>
+            <w:r>
+              <w:rPr>
+                <w:rFonts w:ascii="Segoe UI" w:hAnsi="Segoe UI"/>
+                <w:color w:val="1C1C1E"/>
+                <w:sz w:val="19"/>
+              </w:rPr>
+              <w:t>Dropdown</w:t>
+            </w:r>
+          </w:p>
+        </w:tc>
+        <w:tc>
+          <w:tcPr>
+            <w:tcW w:type="dxa" w:w="3600"/>
+            <w:shd w:val="clear" w:color="auto" w:fill="FFFFFF"/>
+            <w:tcMar>
+              <w:top w:w="100" w:type="dxa"/>
+              <w:bottom w:w="100" w:type="dxa"/>
+              <w:left w:w="150" w:type="dxa"/>
+              <w:right w:w="150" w:type="dxa"/>
+            </w:tcMar>
+            <w:tcBorders>
+              <w:top w:val="none"/>
+              <w:bottom w:val="single" w:sz="4" w:color="E2E8F0"/>
+              <w:left w:val="none"/>
+              <w:right w:val="none"/>
+            </w:tcBorders>
+          </w:tcPr>
+          <w:p>
+            <w:pPr>
+              <w:spacing w:before="40" w:after="40"/>
+              <w:jc w:val="left"/>
+            </w:pPr>
+            <w:r>
+              <w:rPr>
+                <w:rFonts w:ascii="Segoe UI" w:hAnsi="Segoe UI"/>
+                <w:color w:val="1C1C1E"/>
+                <w:sz w:val="19"/>
+              </w:rPr>
+              <w:t>Release, Patch, Hotfix, Milestone, Internal Build</w:t>
+            </w:r>
+          </w:p>
+        </w:tc>
+        <w:tc>
+          <w:tcPr>
+            <w:tcW w:type="dxa" w:w="2304"/>
+            <w:shd w:val="clear" w:color="auto" w:fill="FFFFFF"/>
+            <w:tcMar>
+              <w:top w:w="100" w:type="dxa"/>
+              <w:bottom w:w="100" w:type="dxa"/>
+              <w:left w:w="150" w:type="dxa"/>
+              <w:right w:w="150" w:type="dxa"/>
+            </w:tcMar>
+            <w:tcBorders>
+              <w:top w:val="none"/>
+              <w:bottom w:val="single" w:sz="4" w:color="E2E8F0"/>
+              <w:left w:val="none"/>
+              <w:right w:val="none"/>
+            </w:tcBorders>
+          </w:tcPr>
+          <w:p>
+            <w:pPr>
+              <w:spacing w:before="40" w:after="40"/>
+              <w:jc w:val="left"/>
+            </w:pPr>
+            <w:r>
+              <w:rPr>
+                <w:rFonts w:ascii="Segoe UI" w:hAnsi="Segoe UI"/>
+                <w:color w:val="1C1C1E"/>
+                <w:sz w:val="19"/>
+              </w:rPr>
+              <w:t>Categorisation determining change control governance depth.</w:t>
+            </w:r>
+          </w:p>
+        </w:tc>
+      </w:tr>
+      <w:tr>
+        <w:tc>
+          <w:tcPr>
+            <w:tcW w:type="dxa" w:w="1872"/>
+            <w:shd w:val="clear" w:color="auto" w:fill="F8FAFC"/>
+            <w:tcMar>
+              <w:top w:w="100" w:type="dxa"/>
+              <w:bottom w:w="100" w:type="dxa"/>
+              <w:left w:w="150" w:type="dxa"/>
+              <w:right w:w="150" w:type="dxa"/>
+            </w:tcMar>
+            <w:tcBorders>
+              <w:top w:val="none"/>
+              <w:bottom w:val="single" w:sz="4" w:color="E2E8F0"/>
+              <w:left w:val="none"/>
+              <w:right w:val="none"/>
+            </w:tcBorders>
+          </w:tcPr>
+          <w:p>
+            <w:pPr>
+              <w:spacing w:before="40" w:after="40"/>
+              <w:jc w:val="left"/>
+            </w:pPr>
+            <w:r>
+              <w:rPr>
+                <w:rFonts w:ascii="Segoe UI" w:hAnsi="Segoe UI"/>
+                <w:color w:val="1C1C1E"/>
+                <w:sz w:val="19"/>
+              </w:rPr>
+              <w:t>status</w:t>
+            </w:r>
+          </w:p>
+        </w:tc>
+        <w:tc>
+          <w:tcPr>
+            <w:tcW w:type="dxa" w:w="1728"/>
+            <w:shd w:val="clear" w:color="auto" w:fill="F8FAFC"/>
+            <w:tcMar>
+              <w:top w:w="100" w:type="dxa"/>
+              <w:bottom w:w="100" w:type="dxa"/>
+              <w:left w:w="150" w:type="dxa"/>
+              <w:right w:w="150" w:type="dxa"/>
+            </w:tcMar>
+            <w:tcBorders>
+              <w:top w:val="none"/>
+              <w:bottom w:val="single" w:sz="4" w:color="E2E8F0"/>
+              <w:left w:val="none"/>
+              <w:right w:val="none"/>
+            </w:tcBorders>
+          </w:tcPr>
+          <w:p>
+            <w:pPr>
+              <w:spacing w:before="40" w:after="40"/>
+              <w:jc w:val="left"/>
+            </w:pPr>
+            <w:r>
+              <w:rPr>
+                <w:rFonts w:ascii="Segoe UI" w:hAnsi="Segoe UI"/>
+                <w:color w:val="1C1C1E"/>
+                <w:sz w:val="19"/>
+              </w:rPr>
+              <w:t>Dropdown</w:t>
+            </w:r>
+          </w:p>
+        </w:tc>
+        <w:tc>
+          <w:tcPr>
+            <w:tcW w:type="dxa" w:w="3600"/>
+            <w:shd w:val="clear" w:color="auto" w:fill="F8FAFC"/>
+            <w:tcMar>
+              <w:top w:w="100" w:type="dxa"/>
+              <w:bottom w:w="100" w:type="dxa"/>
+              <w:left w:w="150" w:type="dxa"/>
+              <w:right w:w="150" w:type="dxa"/>
+            </w:tcMar>
+            <w:tcBorders>
+              <w:top w:val="none"/>
+              <w:bottom w:val="single" w:sz="4" w:color="E2E8F0"/>
+              <w:left w:val="none"/>
+              <w:right w:val="none"/>
+            </w:tcBorders>
+          </w:tcPr>
+          <w:p>
+            <w:pPr>
+              <w:spacing w:before="40" w:after="40"/>
+              <w:jc w:val="left"/>
+            </w:pPr>
+            <w:r>
+              <w:rPr>
+                <w:rFonts w:ascii="Segoe UI" w:hAnsi="Segoe UI"/>
+                <w:color w:val="1C1C1E"/>
+                <w:sz w:val="19"/>
+              </w:rPr>
+              <w:t>Scheduled, In Progress, Ready for QA, Deployed, Cancelled</w:t>
+            </w:r>
+          </w:p>
+        </w:tc>
+        <w:tc>
+          <w:tcPr>
+            <w:tcW w:type="dxa" w:w="2304"/>
+            <w:shd w:val="clear" w:color="auto" w:fill="F8FAFC"/>
+            <w:tcMar>
+              <w:top w:w="100" w:type="dxa"/>
+              <w:bottom w:w="100" w:type="dxa"/>
+              <w:left w:w="150" w:type="dxa"/>
+              <w:right w:w="150" w:type="dxa"/>
+            </w:tcMar>
+            <w:tcBorders>
+              <w:top w:val="none"/>
+              <w:bottom w:val="single" w:sz="4" w:color="E2E8F0"/>
+              <w:left w:val="none"/>
+              <w:right w:val="none"/>
+            </w:tcBorders>
+          </w:tcPr>
+          <w:p>
+            <w:pPr>
+              <w:spacing w:before="40" w:after="40"/>
+              <w:jc w:val="left"/>
+            </w:pPr>
+            <w:r>
+              <w:rPr>
+                <w:rFonts w:ascii="Segoe UI" w:hAnsi="Segoe UI"/>
+                <w:color w:val="1C1C1E"/>
+                <w:sz w:val="19"/>
+              </w:rPr>
+              <w:t>Enforces the release lifecycle state machine.</w:t>
+            </w:r>
+          </w:p>
+        </w:tc>
+      </w:tr>
+      <w:tr>
+        <w:tc>
+          <w:tcPr>
+            <w:tcW w:type="dxa" w:w="1872"/>
+            <w:shd w:val="clear" w:color="auto" w:fill="FFFFFF"/>
+            <w:tcMar>
+              <w:top w:w="100" w:type="dxa"/>
+              <w:bottom w:w="100" w:type="dxa"/>
+              <w:left w:w="150" w:type="dxa"/>
+              <w:right w:w="150" w:type="dxa"/>
+            </w:tcMar>
+            <w:tcBorders>
+              <w:top w:val="none"/>
+              <w:bottom w:val="single" w:sz="4" w:color="E2E8F0"/>
+              <w:left w:val="none"/>
+              <w:right w:val="none"/>
+            </w:tcBorders>
+          </w:tcPr>
+          <w:p>
+            <w:pPr>
+              <w:spacing w:before="40" w:after="40"/>
+              <w:jc w:val="left"/>
+            </w:pPr>
+            <w:r>
+              <w:rPr>
+                <w:rFonts w:ascii="Segoe UI" w:hAnsi="Segoe UI"/>
+                <w:color w:val="1C1C1E"/>
+                <w:sz w:val="19"/>
+              </w:rPr>
+              <w:t>targetDate</w:t>
+            </w:r>
+          </w:p>
+        </w:tc>
+        <w:tc>
+          <w:tcPr>
+            <w:tcW w:type="dxa" w:w="1728"/>
+            <w:shd w:val="clear" w:color="auto" w:fill="FFFFFF"/>
+            <w:tcMar>
+              <w:top w:w="100" w:type="dxa"/>
+              <w:bottom w:w="100" w:type="dxa"/>
+              <w:left w:w="150" w:type="dxa"/>
+              <w:right w:w="150" w:type="dxa"/>
+            </w:tcMar>
+            <w:tcBorders>
+              <w:top w:val="none"/>
+              <w:bottom w:val="single" w:sz="4" w:color="E2E8F0"/>
+              <w:left w:val="none"/>
+              <w:right w:val="none"/>
+            </w:tcBorders>
+          </w:tcPr>
+          <w:p>
+            <w:pPr>
+              <w:spacing w:before="40" w:after="40"/>
+              <w:jc w:val="left"/>
+            </w:pPr>
+            <w:r>
+              <w:rPr>
+                <w:rFonts w:ascii="Segoe UI" w:hAnsi="Segoe UI"/>
+                <w:color w:val="1C1C1E"/>
+                <w:sz w:val="19"/>
+              </w:rPr>
+              <w:t>Date (YYYY-MM-DD)</w:t>
+            </w:r>
+          </w:p>
+        </w:tc>
+        <w:tc>
+          <w:tcPr>
+            <w:tcW w:type="dxa" w:w="3600"/>
+            <w:shd w:val="clear" w:color="auto" w:fill="FFFFFF"/>
+            <w:tcMar>
+              <w:top w:w="100" w:type="dxa"/>
+              <w:bottom w:w="100" w:type="dxa"/>
+              <w:left w:w="150" w:type="dxa"/>
+              <w:right w:w="150" w:type="dxa"/>
+            </w:tcMar>
+            <w:tcBorders>
+              <w:top w:val="none"/>
+              <w:bottom w:val="single" w:sz="4" w:color="E2E8F0"/>
+              <w:left w:val="none"/>
+              <w:right w:val="none"/>
+            </w:tcBorders>
+          </w:tcPr>
+          <w:p>
+            <w:pPr>
+              <w:spacing w:before="40" w:after="40"/>
+              <w:jc w:val="left"/>
+            </w:pPr>
+            <w:r>
+              <w:rPr>
+                <w:rFonts w:ascii="Segoe UI" w:hAnsi="Segoe UI"/>
+                <w:color w:val="1C1C1E"/>
+                <w:sz w:val="19"/>
+              </w:rPr>
+              <w:t>Scheduled target delivery or release window date</w:t>
+            </w:r>
+          </w:p>
+        </w:tc>
+        <w:tc>
+          <w:tcPr>
+            <w:tcW w:type="dxa" w:w="2304"/>
+            <w:shd w:val="clear" w:color="auto" w:fill="FFFFFF"/>
+            <w:tcMar>
+              <w:top w:w="100" w:type="dxa"/>
+              <w:bottom w:w="100" w:type="dxa"/>
+              <w:left w:w="150" w:type="dxa"/>
+              <w:right w:w="150" w:type="dxa"/>
+            </w:tcMar>
+            <w:tcBorders>
+              <w:top w:val="none"/>
+              <w:bottom w:val="single" w:sz="4" w:color="E2E8F0"/>
+              <w:left w:val="none"/>
+              <w:right w:val="none"/>
+            </w:tcBorders>
+          </w:tcPr>
+          <w:p>
+            <w:pPr>
+              <w:spacing w:before="40" w:after="40"/>
+              <w:jc w:val="left"/>
+            </w:pPr>
+            <w:r>
+              <w:rPr>
+                <w:rFonts w:ascii="Segoe UI" w:hAnsi="Segoe UI"/>
+                <w:color w:val="1C1C1E"/>
+                <w:sz w:val="19"/>
+              </w:rPr>
+              <w:t>Drives countdown chips, overdue badges, and calendar scheduling.</w:t>
+            </w:r>
+          </w:p>
+        </w:tc>
+      </w:tr>
+      <w:tr>
+        <w:tc>
+          <w:tcPr>
+            <w:tcW w:type="dxa" w:w="1872"/>
+            <w:shd w:val="clear" w:color="auto" w:fill="F8FAFC"/>
+            <w:tcMar>
+              <w:top w:w="100" w:type="dxa"/>
+              <w:bottom w:w="100" w:type="dxa"/>
+              <w:left w:w="150" w:type="dxa"/>
+              <w:right w:w="150" w:type="dxa"/>
+            </w:tcMar>
+            <w:tcBorders>
+              <w:top w:val="none"/>
+              <w:bottom w:val="single" w:sz="4" w:color="E2E8F0"/>
+              <w:left w:val="none"/>
+              <w:right w:val="none"/>
+            </w:tcBorders>
+          </w:tcPr>
+          <w:p>
+            <w:pPr>
+              <w:spacing w:before="40" w:after="40"/>
+              <w:jc w:val="left"/>
+            </w:pPr>
+            <w:r>
+              <w:rPr>
+                <w:rFonts w:ascii="Segoe UI" w:hAnsi="Segoe UI"/>
+                <w:color w:val="1C1C1E"/>
+                <w:sz w:val="19"/>
+              </w:rPr>
+              <w:t>deployedDate</w:t>
+            </w:r>
+          </w:p>
+        </w:tc>
+        <w:tc>
+          <w:tcPr>
+            <w:tcW w:type="dxa" w:w="1728"/>
+            <w:shd w:val="clear" w:color="auto" w:fill="F8FAFC"/>
+            <w:tcMar>
+              <w:top w:w="100" w:type="dxa"/>
+              <w:bottom w:w="100" w:type="dxa"/>
+              <w:left w:w="150" w:type="dxa"/>
+              <w:right w:w="150" w:type="dxa"/>
+            </w:tcMar>
+            <w:tcBorders>
+              <w:top w:val="none"/>
+              <w:bottom w:val="single" w:sz="4" w:color="E2E8F0"/>
+              <w:left w:val="none"/>
+              <w:right w:val="none"/>
+            </w:tcBorders>
+          </w:tcPr>
+          <w:p>
+            <w:pPr>
+              <w:spacing w:before="40" w:after="40"/>
+              <w:jc w:val="left"/>
+            </w:pPr>
+            <w:r>
+              <w:rPr>
+                <w:rFonts w:ascii="Segoe UI" w:hAnsi="Segoe UI"/>
+                <w:color w:val="1C1C1E"/>
+                <w:sz w:val="19"/>
+              </w:rPr>
+              <w:t>Date (YYYY-MM-DD)</w:t>
+            </w:r>
+          </w:p>
+        </w:tc>
+        <w:tc>
+          <w:tcPr>
+            <w:tcW w:type="dxa" w:w="3600"/>
+            <w:shd w:val="clear" w:color="auto" w:fill="F8FAFC"/>
+            <w:tcMar>
+              <w:top w:w="100" w:type="dxa"/>
+              <w:bottom w:w="100" w:type="dxa"/>
+              <w:left w:w="150" w:type="dxa"/>
+              <w:right w:w="150" w:type="dxa"/>
+            </w:tcMar>
+            <w:tcBorders>
+              <w:top w:val="none"/>
+              <w:bottom w:val="single" w:sz="4" w:color="E2E8F0"/>
+              <w:left w:val="none"/>
+              <w:right w:val="none"/>
+            </w:tcBorders>
+          </w:tcPr>
+          <w:p>
+            <w:pPr>
+              <w:spacing w:before="40" w:after="40"/>
+              <w:jc w:val="left"/>
+            </w:pPr>
+            <w:r>
+              <w:rPr>
+                <w:rFonts w:ascii="Segoe UI" w:hAnsi="Segoe UI"/>
+                <w:color w:val="1C1C1E"/>
+                <w:sz w:val="19"/>
+              </w:rPr>
+              <w:t>Actual date deployed to staging or production</w:t>
+            </w:r>
+          </w:p>
+        </w:tc>
+        <w:tc>
+          <w:tcPr>
+            <w:tcW w:type="dxa" w:w="2304"/>
+            <w:shd w:val="clear" w:color="auto" w:fill="F8FAFC"/>
+            <w:tcMar>
+              <w:top w:w="100" w:type="dxa"/>
+              <w:bottom w:w="100" w:type="dxa"/>
+              <w:left w:w="150" w:type="dxa"/>
+              <w:right w:w="150" w:type="dxa"/>
+            </w:tcMar>
+            <w:tcBorders>
+              <w:top w:val="none"/>
+              <w:bottom w:val="single" w:sz="4" w:color="E2E8F0"/>
+              <w:left w:val="none"/>
+              <w:right w:val="none"/>
+            </w:tcBorders>
+          </w:tcPr>
+          <w:p>
+            <w:pPr>
+              <w:spacing w:before="40" w:after="40"/>
+              <w:jc w:val="left"/>
+            </w:pPr>
+            <w:r>
+              <w:rPr>
+                <w:rFonts w:ascii="Segoe UI" w:hAnsi="Segoe UI"/>
+                <w:color w:val="1C1C1E"/>
+                <w:sz w:val="19"/>
+              </w:rPr>
+              <w:t>Historical audit record for delivery SLA and velocity metrics.</w:t>
+            </w:r>
+          </w:p>
+        </w:tc>
+      </w:tr>
+      <w:tr>
+        <w:tc>
+          <w:tcPr>
+            <w:tcW w:type="dxa" w:w="1872"/>
+            <w:shd w:val="clear" w:color="auto" w:fill="FFFFFF"/>
+            <w:tcMar>
+              <w:top w:w="100" w:type="dxa"/>
+              <w:bottom w:w="100" w:type="dxa"/>
+              <w:left w:w="150" w:type="dxa"/>
+              <w:right w:w="150" w:type="dxa"/>
+            </w:tcMar>
+            <w:tcBorders>
+              <w:top w:val="none"/>
+              <w:bottom w:val="single" w:sz="4" w:color="E2E8F0"/>
+              <w:left w:val="none"/>
+              <w:right w:val="none"/>
+            </w:tcBorders>
+          </w:tcPr>
+          <w:p>
+            <w:pPr>
+              <w:spacing w:before="40" w:after="40"/>
+              <w:jc w:val="left"/>
+            </w:pPr>
+            <w:r>
+              <w:rPr>
+                <w:rFonts w:ascii="Segoe UI" w:hAnsi="Segoe UI"/>
+                <w:color w:val="1C1C1E"/>
+                <w:sz w:val="19"/>
+              </w:rPr>
+              <w:t>environment</w:t>
+            </w:r>
+          </w:p>
+        </w:tc>
+        <w:tc>
+          <w:tcPr>
+            <w:tcW w:type="dxa" w:w="1728"/>
+            <w:shd w:val="clear" w:color="auto" w:fill="FFFFFF"/>
+            <w:tcMar>
+              <w:top w:w="100" w:type="dxa"/>
+              <w:bottom w:w="100" w:type="dxa"/>
+              <w:left w:w="150" w:type="dxa"/>
+              <w:right w:w="150" w:type="dxa"/>
+            </w:tcMar>
+            <w:tcBorders>
+              <w:top w:val="none"/>
+              <w:bottom w:val="single" w:sz="4" w:color="E2E8F0"/>
+              <w:left w:val="none"/>
+              <w:right w:val="none"/>
+            </w:tcBorders>
+          </w:tcPr>
+          <w:p>
+            <w:pPr>
+              <w:spacing w:before="40" w:after="40"/>
+              <w:jc w:val="left"/>
+            </w:pPr>
+            <w:r>
+              <w:rPr>
+                <w:rFonts w:ascii="Segoe UI" w:hAnsi="Segoe UI"/>
+                <w:color w:val="1C1C1E"/>
+                <w:sz w:val="19"/>
+              </w:rPr>
+              <w:t>Dropdown</w:t>
+            </w:r>
+          </w:p>
+        </w:tc>
+        <w:tc>
+          <w:tcPr>
+            <w:tcW w:type="dxa" w:w="3600"/>
+            <w:shd w:val="clear" w:color="auto" w:fill="FFFFFF"/>
+            <w:tcMar>
+              <w:top w:w="100" w:type="dxa"/>
+              <w:bottom w:w="100" w:type="dxa"/>
+              <w:left w:w="150" w:type="dxa"/>
+              <w:right w:w="150" w:type="dxa"/>
+            </w:tcMar>
+            <w:tcBorders>
+              <w:top w:val="none"/>
+              <w:bottom w:val="single" w:sz="4" w:color="E2E8F0"/>
+              <w:left w:val="none"/>
+              <w:right w:val="none"/>
+            </w:tcBorders>
+          </w:tcPr>
+          <w:p>
+            <w:pPr>
+              <w:spacing w:before="40" w:after="40"/>
+              <w:jc w:val="left"/>
+            </w:pPr>
+            <w:r>
+              <w:rPr>
+                <w:rFonts w:ascii="Segoe UI" w:hAnsi="Segoe UI"/>
+                <w:color w:val="1C1C1E"/>
+                <w:sz w:val="19"/>
+              </w:rPr>
+              <w:t>DEV, QA / Test, Staging / UAT, Pre-Prod, Production</w:t>
+            </w:r>
+          </w:p>
+        </w:tc>
+        <w:tc>
+          <w:tcPr>
+            <w:tcW w:type="dxa" w:w="2304"/>
+            <w:shd w:val="clear" w:color="auto" w:fill="FFFFFF"/>
+            <w:tcMar>
+              <w:top w:w="100" w:type="dxa"/>
+              <w:bottom w:w="100" w:type="dxa"/>
+              <w:left w:w="150" w:type="dxa"/>
+              <w:right w:w="150" w:type="dxa"/>
+            </w:tcMar>
+            <w:tcBorders>
+              <w:top w:val="none"/>
+              <w:bottom w:val="single" w:sz="4" w:color="E2E8F0"/>
+              <w:left w:val="none"/>
+              <w:right w:val="none"/>
+            </w:tcBorders>
+          </w:tcPr>
+          <w:p>
+            <w:pPr>
+              <w:spacing w:before="40" w:after="40"/>
+              <w:jc w:val="left"/>
+            </w:pPr>
+            <w:r>
+              <w:rPr>
+                <w:rFonts w:ascii="Segoe UI" w:hAnsi="Segoe UI"/>
+                <w:color w:val="1C1C1E"/>
+                <w:sz w:val="19"/>
+              </w:rPr>
+              <w:t>Target deployment infrastructure environment tier.</w:t>
+            </w:r>
+          </w:p>
+        </w:tc>
+      </w:tr>
+      <w:tr>
+        <w:tc>
+          <w:tcPr>
+            <w:tcW w:type="dxa" w:w="1872"/>
+            <w:shd w:val="clear" w:color="auto" w:fill="F8FAFC"/>
+            <w:tcMar>
+              <w:top w:w="100" w:type="dxa"/>
+              <w:bottom w:w="100" w:type="dxa"/>
+              <w:left w:w="150" w:type="dxa"/>
+              <w:right w:w="150" w:type="dxa"/>
+            </w:tcMar>
+            <w:tcBorders>
+              <w:top w:val="none"/>
+              <w:bottom w:val="single" w:sz="4" w:color="E2E8F0"/>
+              <w:left w:val="none"/>
+              <w:right w:val="none"/>
+            </w:tcBorders>
+          </w:tcPr>
+          <w:p>
+            <w:pPr>
+              <w:spacing w:before="40" w:after="40"/>
+              <w:jc w:val="left"/>
+            </w:pPr>
+            <w:r>
+              <w:rPr>
+                <w:rFonts w:ascii="Segoe UI" w:hAnsi="Segoe UI"/>
+                <w:color w:val="1C1C1E"/>
+                <w:sz w:val="19"/>
+              </w:rPr>
+              <w:t>lead</w:t>
+            </w:r>
+          </w:p>
+        </w:tc>
+        <w:tc>
+          <w:tcPr>
+            <w:tcW w:type="dxa" w:w="1728"/>
+            <w:shd w:val="clear" w:color="auto" w:fill="F8FAFC"/>
+            <w:tcMar>
+              <w:top w:w="100" w:type="dxa"/>
+              <w:bottom w:w="100" w:type="dxa"/>
+              <w:left w:w="150" w:type="dxa"/>
+              <w:right w:w="150" w:type="dxa"/>
+            </w:tcMar>
+            <w:tcBorders>
+              <w:top w:val="none"/>
+              <w:bottom w:val="single" w:sz="4" w:color="E2E8F0"/>
+              <w:left w:val="none"/>
+              <w:right w:val="none"/>
+            </w:tcBorders>
+          </w:tcPr>
+          <w:p>
+            <w:pPr>
+              <w:spacing w:before="40" w:after="40"/>
+              <w:jc w:val="left"/>
+            </w:pPr>
+            <w:r>
+              <w:rPr>
+                <w:rFonts w:ascii="Segoe UI" w:hAnsi="Segoe UI"/>
+                <w:color w:val="1C1C1E"/>
+                <w:sz w:val="19"/>
+              </w:rPr>
+              <w:t>Dropdown</w:t>
+            </w:r>
+          </w:p>
+        </w:tc>
+        <w:tc>
+          <w:tcPr>
+            <w:tcW w:type="dxa" w:w="3600"/>
+            <w:shd w:val="clear" w:color="auto" w:fill="F8FAFC"/>
+            <w:tcMar>
+              <w:top w:w="100" w:type="dxa"/>
+              <w:bottom w:w="100" w:type="dxa"/>
+              <w:left w:w="150" w:type="dxa"/>
+              <w:right w:w="150" w:type="dxa"/>
+            </w:tcMar>
+            <w:tcBorders>
+              <w:top w:val="none"/>
+              <w:bottom w:val="single" w:sz="4" w:color="E2E8F0"/>
+              <w:left w:val="none"/>
+              <w:right w:val="none"/>
+            </w:tcBorders>
+          </w:tcPr>
+          <w:p>
+            <w:pPr>
+              <w:spacing w:before="40" w:after="40"/>
+              <w:jc w:val="left"/>
+            </w:pPr>
+            <w:r>
+              <w:rPr>
+                <w:rFonts w:ascii="Segoe UI" w:hAnsi="Segoe UI"/>
+                <w:color w:val="1C1C1E"/>
+                <w:sz w:val="19"/>
+              </w:rPr>
+              <w:t>Delivery lead or responsible release engineer</w:t>
+            </w:r>
+          </w:p>
+        </w:tc>
+        <w:tc>
+          <w:tcPr>
+            <w:tcW w:type="dxa" w:w="2304"/>
+            <w:shd w:val="clear" w:color="auto" w:fill="F8FAFC"/>
+            <w:tcMar>
+              <w:top w:w="100" w:type="dxa"/>
+              <w:bottom w:w="100" w:type="dxa"/>
+              <w:left w:w="150" w:type="dxa"/>
+              <w:right w:w="150" w:type="dxa"/>
+            </w:tcMar>
+            <w:tcBorders>
+              <w:top w:val="none"/>
+              <w:bottom w:val="single" w:sz="4" w:color="E2E8F0"/>
+              <w:left w:val="none"/>
+              <w:right w:val="none"/>
+            </w:tcBorders>
+          </w:tcPr>
+          <w:p>
+            <w:pPr>
+              <w:spacing w:before="40" w:after="40"/>
+              <w:jc w:val="left"/>
+            </w:pPr>
+            <w:r>
+              <w:rPr>
+                <w:rFonts w:ascii="Segoe UI" w:hAnsi="Segoe UI"/>
+                <w:color w:val="1C1C1E"/>
+                <w:sz w:val="19"/>
+              </w:rPr>
+              <w:t>Owner responsible for change review, deployment checklist, and sign-off.</w:t>
+            </w:r>
+          </w:p>
+        </w:tc>
+      </w:tr>
+      <w:tr>
+        <w:tc>
+          <w:tcPr>
+            <w:tcW w:type="dxa" w:w="1872"/>
+            <w:shd w:val="clear" w:color="auto" w:fill="FFFFFF"/>
+            <w:tcMar>
+              <w:top w:w="100" w:type="dxa"/>
+              <w:bottom w:w="100" w:type="dxa"/>
+              <w:left w:w="150" w:type="dxa"/>
+              <w:right w:w="150" w:type="dxa"/>
+            </w:tcMar>
+            <w:tcBorders>
+              <w:top w:val="none"/>
+              <w:bottom w:val="single" w:sz="4" w:color="E2E8F0"/>
+              <w:left w:val="none"/>
+              <w:right w:val="none"/>
+            </w:tcBorders>
+          </w:tcPr>
+          <w:p>
+            <w:pPr>
+              <w:spacing w:before="40" w:after="40"/>
+              <w:jc w:val="left"/>
+            </w:pPr>
+            <w:r>
+              <w:rPr>
+                <w:rFonts w:ascii="Segoe UI" w:hAnsi="Segoe UI"/>
+                <w:color w:val="1C1C1E"/>
+                <w:sz w:val="19"/>
+              </w:rPr>
+              <w:t>linkedTaskIds</w:t>
+            </w:r>
+          </w:p>
+        </w:tc>
+        <w:tc>
+          <w:tcPr>
+            <w:tcW w:type="dxa" w:w="1728"/>
+            <w:shd w:val="clear" w:color="auto" w:fill="FFFFFF"/>
+            <w:tcMar>
+              <w:top w:w="100" w:type="dxa"/>
+              <w:bottom w:w="100" w:type="dxa"/>
+              <w:left w:w="150" w:type="dxa"/>
+              <w:right w:w="150" w:type="dxa"/>
+            </w:tcMar>
+            <w:tcBorders>
+              <w:top w:val="none"/>
+              <w:bottom w:val="single" w:sz="4" w:color="E2E8F0"/>
+              <w:left w:val="none"/>
+              <w:right w:val="none"/>
+            </w:tcBorders>
+          </w:tcPr>
+          <w:p>
+            <w:pPr>
+              <w:spacing w:before="40" w:after="40"/>
+              <w:jc w:val="left"/>
+            </w:pPr>
+            <w:r>
+              <w:rPr>
+                <w:rFonts w:ascii="Segoe UI" w:hAnsi="Segoe UI"/>
+                <w:color w:val="1C1C1E"/>
+                <w:sz w:val="19"/>
+              </w:rPr>
+              <w:t>Array / CSV</w:t>
+            </w:r>
+          </w:p>
+        </w:tc>
+        <w:tc>
+          <w:tcPr>
+            <w:tcW w:type="dxa" w:w="3600"/>
+            <w:shd w:val="clear" w:color="auto" w:fill="FFFFFF"/>
+            <w:tcMar>
+              <w:top w:w="100" w:type="dxa"/>
+              <w:bottom w:w="100" w:type="dxa"/>
+              <w:left w:w="150" w:type="dxa"/>
+              <w:right w:w="150" w:type="dxa"/>
+            </w:tcMar>
+            <w:tcBorders>
+              <w:top w:val="none"/>
+              <w:bottom w:val="single" w:sz="4" w:color="E2E8F0"/>
+              <w:left w:val="none"/>
+              <w:right w:val="none"/>
+            </w:tcBorders>
+          </w:tcPr>
+          <w:p>
+            <w:pPr>
+              <w:spacing w:before="40" w:after="40"/>
+              <w:jc w:val="left"/>
+            </w:pPr>
+            <w:r>
+              <w:rPr>
+                <w:rFonts w:ascii="Segoe UI" w:hAnsi="Segoe UI"/>
+                <w:color w:val="1C1C1E"/>
+                <w:sz w:val="19"/>
+              </w:rPr>
+              <w:t>Referenced WBS task identifiers (e.g., TASK-001, TASK-004)</w:t>
+            </w:r>
+          </w:p>
+        </w:tc>
+        <w:tc>
+          <w:tcPr>
+            <w:tcW w:type="dxa" w:w="2304"/>
+            <w:shd w:val="clear" w:color="auto" w:fill="FFFFFF"/>
+            <w:tcMar>
+              <w:top w:w="100" w:type="dxa"/>
+              <w:bottom w:w="100" w:type="dxa"/>
+              <w:left w:w="150" w:type="dxa"/>
+              <w:right w:w="150" w:type="dxa"/>
+            </w:tcMar>
+            <w:tcBorders>
+              <w:top w:val="none"/>
+              <w:bottom w:val="single" w:sz="4" w:color="E2E8F0"/>
+              <w:left w:val="none"/>
+              <w:right w:val="none"/>
+            </w:tcBorders>
+          </w:tcPr>
+          <w:p>
+            <w:pPr>
+              <w:spacing w:before="40" w:after="40"/>
+              <w:jc w:val="left"/>
+            </w:pPr>
+            <w:r>
+              <w:rPr>
+                <w:rFonts w:ascii="Segoe UI" w:hAnsi="Segoe UI"/>
+                <w:color w:val="1C1C1E"/>
+                <w:sz w:val="19"/>
+              </w:rPr>
+              <w:t>Bidirectional traceability to work breakdown structure.</w:t>
+            </w:r>
+          </w:p>
+        </w:tc>
+      </w:tr>
+      <w:tr>
+        <w:tc>
+          <w:tcPr>
+            <w:tcW w:type="dxa" w:w="1872"/>
+            <w:shd w:val="clear" w:color="auto" w:fill="F8FAFC"/>
+            <w:tcMar>
+              <w:top w:w="100" w:type="dxa"/>
+              <w:bottom w:w="100" w:type="dxa"/>
+              <w:left w:w="150" w:type="dxa"/>
+              <w:right w:w="150" w:type="dxa"/>
+            </w:tcMar>
+            <w:tcBorders>
+              <w:top w:val="none"/>
+              <w:bottom w:val="single" w:sz="4" w:color="E2E8F0"/>
+              <w:left w:val="none"/>
+              <w:right w:val="none"/>
+            </w:tcBorders>
+          </w:tcPr>
+          <w:p>
+            <w:pPr>
+              <w:spacing w:before="40" w:after="40"/>
+              <w:jc w:val="left"/>
+            </w:pPr>
+            <w:r>
+              <w:rPr>
+                <w:rFonts w:ascii="Segoe UI" w:hAnsi="Segoe UI"/>
+                <w:color w:val="1C1C1E"/>
+                <w:sz w:val="19"/>
+              </w:rPr>
+              <w:t>linkedScreenIds</w:t>
+            </w:r>
+          </w:p>
+        </w:tc>
+        <w:tc>
+          <w:tcPr>
+            <w:tcW w:type="dxa" w:w="1728"/>
+            <w:shd w:val="clear" w:color="auto" w:fill="F8FAFC"/>
+            <w:tcMar>
+              <w:top w:w="100" w:type="dxa"/>
+              <w:bottom w:w="100" w:type="dxa"/>
+              <w:left w:w="150" w:type="dxa"/>
+              <w:right w:w="150" w:type="dxa"/>
+            </w:tcMar>
+            <w:tcBorders>
+              <w:top w:val="none"/>
+              <w:bottom w:val="single" w:sz="4" w:color="E2E8F0"/>
+              <w:left w:val="none"/>
+              <w:right w:val="none"/>
+            </w:tcBorders>
+          </w:tcPr>
+          <w:p>
+            <w:pPr>
+              <w:spacing w:before="40" w:after="40"/>
+              <w:jc w:val="left"/>
+            </w:pPr>
+            <w:r>
+              <w:rPr>
+                <w:rFonts w:ascii="Segoe UI" w:hAnsi="Segoe UI"/>
+                <w:color w:val="1C1C1E"/>
+                <w:sz w:val="19"/>
+              </w:rPr>
+              <w:t>Array / CSV</w:t>
+            </w:r>
+          </w:p>
+        </w:tc>
+        <w:tc>
+          <w:tcPr>
+            <w:tcW w:type="dxa" w:w="3600"/>
+            <w:shd w:val="clear" w:color="auto" w:fill="F8FAFC"/>
+            <w:tcMar>
+              <w:top w:w="100" w:type="dxa"/>
+              <w:bottom w:w="100" w:type="dxa"/>
+              <w:left w:w="150" w:type="dxa"/>
+              <w:right w:w="150" w:type="dxa"/>
+            </w:tcMar>
+            <w:tcBorders>
+              <w:top w:val="none"/>
+              <w:bottom w:val="single" w:sz="4" w:color="E2E8F0"/>
+              <w:left w:val="none"/>
+              <w:right w:val="none"/>
+            </w:tcBorders>
+          </w:tcPr>
+          <w:p>
+            <w:pPr>
+              <w:spacing w:before="40" w:after="40"/>
+              <w:jc w:val="left"/>
+            </w:pPr>
+            <w:r>
+              <w:rPr>
+                <w:rFonts w:ascii="Segoe UI" w:hAnsi="Segoe UI"/>
+                <w:color w:val="1C1C1E"/>
+                <w:sz w:val="19"/>
+              </w:rPr>
+              <w:t>Referenced GUI screens (e.g., SCR-001, SCR-005)</w:t>
+            </w:r>
+          </w:p>
+        </w:tc>
+        <w:tc>
+          <w:tcPr>
+            <w:tcW w:type="dxa" w:w="2304"/>
+            <w:shd w:val="clear" w:color="auto" w:fill="F8FAFC"/>
+            <w:tcMar>
+              <w:top w:w="100" w:type="dxa"/>
+              <w:bottom w:w="100" w:type="dxa"/>
+              <w:left w:w="150" w:type="dxa"/>
+              <w:right w:w="150" w:type="dxa"/>
+            </w:tcMar>
+            <w:tcBorders>
+              <w:top w:val="none"/>
+              <w:bottom w:val="single" w:sz="4" w:color="E2E8F0"/>
+              <w:left w:val="none"/>
+              <w:right w:val="none"/>
+            </w:tcBorders>
+          </w:tcPr>
+          <w:p>
+            <w:pPr>
+              <w:spacing w:before="40" w:after="40"/>
+              <w:jc w:val="left"/>
+            </w:pPr>
+            <w:r>
+              <w:rPr>
+                <w:rFonts w:ascii="Segoe UI" w:hAnsi="Segoe UI"/>
+                <w:color w:val="1C1C1E"/>
+                <w:sz w:val="19"/>
+              </w:rPr>
+              <w:t>Impact mapping from code releases to user-facing interfaces.</w:t>
+            </w:r>
+          </w:p>
+        </w:tc>
+      </w:tr>
+      <w:tr>
+        <w:tc>
+          <w:tcPr>
+            <w:tcW w:type="dxa" w:w="1872"/>
+            <w:shd w:val="clear" w:color="auto" w:fill="FFFFFF"/>
+            <w:tcMar>
+              <w:top w:w="100" w:type="dxa"/>
+              <w:bottom w:w="100" w:type="dxa"/>
+              <w:left w:w="150" w:type="dxa"/>
+              <w:right w:w="150" w:type="dxa"/>
+            </w:tcMar>
+            <w:tcBorders>
+              <w:top w:val="none"/>
+              <w:bottom w:val="single" w:sz="4" w:color="E2E8F0"/>
+              <w:left w:val="none"/>
+              <w:right w:val="none"/>
+            </w:tcBorders>
+          </w:tcPr>
+          <w:p>
+            <w:pPr>
+              <w:spacing w:before="40" w:after="40"/>
+              <w:jc w:val="left"/>
+            </w:pPr>
+            <w:r>
+              <w:rPr>
+                <w:rFonts w:ascii="Segoe UI" w:hAnsi="Segoe UI"/>
+                <w:color w:val="1C1C1E"/>
+                <w:sz w:val="19"/>
+              </w:rPr>
+              <w:t>almPdnNumber</w:t>
+            </w:r>
+          </w:p>
+        </w:tc>
+        <w:tc>
+          <w:tcPr>
+            <w:tcW w:type="dxa" w:w="1728"/>
+            <w:shd w:val="clear" w:color="auto" w:fill="FFFFFF"/>
+            <w:tcMar>
+              <w:top w:w="100" w:type="dxa"/>
+              <w:bottom w:w="100" w:type="dxa"/>
+              <w:left w:w="150" w:type="dxa"/>
+              <w:right w:w="150" w:type="dxa"/>
+            </w:tcMar>
+            <w:tcBorders>
+              <w:top w:val="none"/>
+              <w:bottom w:val="single" w:sz="4" w:color="E2E8F0"/>
+              <w:left w:val="none"/>
+              <w:right w:val="none"/>
+            </w:tcBorders>
+          </w:tcPr>
+          <w:p>
+            <w:pPr>
+              <w:spacing w:before="40" w:after="40"/>
+              <w:jc w:val="left"/>
+            </w:pPr>
+            <w:r>
+              <w:rPr>
+                <w:rFonts w:ascii="Segoe UI" w:hAnsi="Segoe UI"/>
+                <w:color w:val="1C1C1E"/>
+                <w:sz w:val="19"/>
+              </w:rPr>
+              <w:t>String</w:t>
+            </w:r>
+          </w:p>
+        </w:tc>
+        <w:tc>
+          <w:tcPr>
+            <w:tcW w:type="dxa" w:w="3600"/>
+            <w:shd w:val="clear" w:color="auto" w:fill="FFFFFF"/>
+            <w:tcMar>
+              <w:top w:w="100" w:type="dxa"/>
+              <w:bottom w:w="100" w:type="dxa"/>
+              <w:left w:w="150" w:type="dxa"/>
+              <w:right w:w="150" w:type="dxa"/>
+            </w:tcMar>
+            <w:tcBorders>
+              <w:top w:val="none"/>
+              <w:bottom w:val="single" w:sz="4" w:color="E2E8F0"/>
+              <w:left w:val="none"/>
+              <w:right w:val="none"/>
+            </w:tcBorders>
+          </w:tcPr>
+          <w:p>
+            <w:pPr>
+              <w:spacing w:before="40" w:after="40"/>
+              <w:jc w:val="left"/>
+            </w:pPr>
+            <w:r>
+              <w:rPr>
+                <w:rFonts w:ascii="Segoe UI" w:hAnsi="Segoe UI"/>
+                <w:color w:val="1C1C1E"/>
+                <w:sz w:val="19"/>
+              </w:rPr>
+              <w:t>ALM / PDN work item reference (e.g., PDN-88421)</w:t>
+            </w:r>
+          </w:p>
+        </w:tc>
+        <w:tc>
+          <w:tcPr>
+            <w:tcW w:type="dxa" w:w="2304"/>
+            <w:shd w:val="clear" w:color="auto" w:fill="FFFFFF"/>
+            <w:tcMar>
+              <w:top w:w="100" w:type="dxa"/>
+              <w:bottom w:w="100" w:type="dxa"/>
+              <w:left w:w="150" w:type="dxa"/>
+              <w:right w:w="150" w:type="dxa"/>
+            </w:tcMar>
+            <w:tcBorders>
+              <w:top w:val="none"/>
+              <w:bottom w:val="single" w:sz="4" w:color="E2E8F0"/>
+              <w:left w:val="none"/>
+              <w:right w:val="none"/>
+            </w:tcBorders>
+          </w:tcPr>
+          <w:p>
+            <w:pPr>
+              <w:spacing w:before="40" w:after="40"/>
+              <w:jc w:val="left"/>
+            </w:pPr>
+            <w:r>
+              <w:rPr>
+                <w:rFonts w:ascii="Segoe UI" w:hAnsi="Segoe UI"/>
+                <w:color w:val="1C1C1E"/>
+                <w:sz w:val="19"/>
+              </w:rPr>
+              <w:t>Enterprise ALM synchronization for corporate compliance.</w:t>
+            </w:r>
+          </w:p>
+        </w:tc>
+      </w:tr>
+      <w:tr>
+        <w:tc>
+          <w:tcPr>
+            <w:tcW w:type="dxa" w:w="1872"/>
+            <w:shd w:val="clear" w:color="auto" w:fill="F8FAFC"/>
+            <w:tcMar>
+              <w:top w:w="100" w:type="dxa"/>
+              <w:bottom w:w="100" w:type="dxa"/>
+              <w:left w:w="150" w:type="dxa"/>
+              <w:right w:w="150" w:type="dxa"/>
+            </w:tcMar>
+            <w:tcBorders>
+              <w:top w:val="none"/>
+              <w:bottom w:val="single" w:sz="4" w:color="E2E8F0"/>
+              <w:left w:val="none"/>
+              <w:right w:val="none"/>
+            </w:tcBorders>
+          </w:tcPr>
+          <w:p>
+            <w:pPr>
+              <w:spacing w:before="40" w:after="40"/>
+              <w:jc w:val="left"/>
+            </w:pPr>
+            <w:r>
+              <w:rPr>
+                <w:rFonts w:ascii="Segoe UI" w:hAnsi="Segoe UI"/>
+                <w:color w:val="1C1C1E"/>
+                <w:sz w:val="19"/>
+              </w:rPr>
+              <w:t>notes</w:t>
+            </w:r>
+          </w:p>
+        </w:tc>
+        <w:tc>
+          <w:tcPr>
+            <w:tcW w:type="dxa" w:w="1728"/>
+            <w:shd w:val="clear" w:color="auto" w:fill="F8FAFC"/>
+            <w:tcMar>
+              <w:top w:w="100" w:type="dxa"/>
+              <w:bottom w:w="100" w:type="dxa"/>
+              <w:left w:w="150" w:type="dxa"/>
+              <w:right w:w="150" w:type="dxa"/>
+            </w:tcMar>
+            <w:tcBorders>
+              <w:top w:val="none"/>
+              <w:bottom w:val="single" w:sz="4" w:color="E2E8F0"/>
+              <w:left w:val="none"/>
+              <w:right w:val="none"/>
+            </w:tcBorders>
+          </w:tcPr>
+          <w:p>
+            <w:pPr>
+              <w:spacing w:before="40" w:after="40"/>
+              <w:jc w:val="left"/>
+            </w:pPr>
+            <w:r>
+              <w:rPr>
+                <w:rFonts w:ascii="Segoe UI" w:hAnsi="Segoe UI"/>
+                <w:color w:val="1C1C1E"/>
+                <w:sz w:val="19"/>
+              </w:rPr>
+              <w:t>String (Rich)</w:t>
+            </w:r>
+          </w:p>
+        </w:tc>
+        <w:tc>
+          <w:tcPr>
+            <w:tcW w:type="dxa" w:w="3600"/>
+            <w:shd w:val="clear" w:color="auto" w:fill="F8FAFC"/>
+            <w:tcMar>
+              <w:top w:w="100" w:type="dxa"/>
+              <w:bottom w:w="100" w:type="dxa"/>
+              <w:left w:w="150" w:type="dxa"/>
+              <w:right w:w="150" w:type="dxa"/>
+            </w:tcMar>
+            <w:tcBorders>
+              <w:top w:val="none"/>
+              <w:bottom w:val="single" w:sz="4" w:color="E2E8F0"/>
+              <w:left w:val="none"/>
+              <w:right w:val="none"/>
+            </w:tcBorders>
+          </w:tcPr>
+          <w:p>
+            <w:pPr>
+              <w:spacing w:before="40" w:after="40"/>
+              <w:jc w:val="left"/>
+            </w:pPr>
+            <w:r>
+              <w:rPr>
+                <w:rFonts w:ascii="Segoe UI" w:hAnsi="Segoe UI"/>
+                <w:color w:val="1C1C1E"/>
+                <w:sz w:val="19"/>
+              </w:rPr>
+              <w:t>Deployment notes, pre-release checklists, rollback plan</w:t>
+            </w:r>
+          </w:p>
+        </w:tc>
+        <w:tc>
+          <w:tcPr>
+            <w:tcW w:type="dxa" w:w="2304"/>
+            <w:shd w:val="clear" w:color="auto" w:fill="F8FAFC"/>
+            <w:tcMar>
+              <w:top w:w="100" w:type="dxa"/>
+              <w:bottom w:w="100" w:type="dxa"/>
+              <w:left w:w="150" w:type="dxa"/>
+              <w:right w:w="150" w:type="dxa"/>
+            </w:tcMar>
+            <w:tcBorders>
+              <w:top w:val="none"/>
+              <w:bottom w:val="single" w:sz="4" w:color="E2E8F0"/>
+              <w:left w:val="none"/>
+              <w:right w:val="none"/>
+            </w:tcBorders>
+          </w:tcPr>
+          <w:p>
+            <w:pPr>
+              <w:spacing w:before="40" w:after="40"/>
+              <w:jc w:val="left"/>
+            </w:pPr>
+            <w:r>
+              <w:rPr>
+                <w:rFonts w:ascii="Segoe UI" w:hAnsi="Segoe UI"/>
+                <w:color w:val="1C1C1E"/>
+                <w:sz w:val="19"/>
+              </w:rPr>
+              <w:t>Operational instructions for execution and incident fallback.</w:t>
+            </w:r>
+          </w:p>
+        </w:tc>
+      </w:tr>
+    </w:tbl>
+    <w:p>
+      <w:pPr>
+        <w:spacing w:after="160"/>
+      </w:pPr>
+    </w:p>
+    <w:p>
+      <w:pPr>
+        <w:pStyle w:val="Heading2"/>
+        <w:keepNext/>
+        <w:spacing w:before="320" w:after="120"/>
+      </w:pPr>
+      <w:r>
+        <w:rPr>
+          <w:rFonts w:ascii="Segoe UI" w:hAnsi="Segoe UI"/>
+          <w:color w:val="1E9ED5"/>
+        </w:rPr>
+        <w:t>3.2  Bidirectional Multi-Linkage Engine</w:t>
+      </w:r>
+    </w:p>
+    <w:p>
+      <w:pPr>
+        <w:spacing w:before="0" w:after="120"/>
+      </w:pPr>
+      <w:r>
+        <w:rPr>
+          <w:rFonts w:ascii="Segoe UI" w:hAnsi="Segoe UI"/>
+          <w:sz w:val="21"/>
+        </w:rPr>
+        <w:t>A cornerstone capability of the Deliveries module is bidirectional multi-linkage. Deliveries are not isolated milestones; they connect directly to WBS Tasks and GUI Screens:</w:t>
+      </w:r>
+    </w:p>
+    <w:p>
+      <w:pPr>
+        <w:pStyle w:val="ListBullet"/>
+        <w:spacing w:before="0" w:after="60"/>
+        <w:ind w:left="360"/>
+      </w:pPr>
+      <w:r>
+        <w:rPr>
+          <w:rFonts w:ascii="Segoe UI" w:hAnsi="Segoe UI"/>
+          <w:sz w:val="21"/>
+        </w:rPr>
+        <w:t>Multi-Task Association: Multiple task IDs can be linked to a single delivery (e.g. TASK-001, TASK-003, TASK-007).</w:t>
+      </w:r>
+    </w:p>
+    <w:p>
+      <w:pPr>
+        <w:pStyle w:val="ListBullet"/>
+        <w:spacing w:before="0" w:after="60"/>
+        <w:ind w:left="360"/>
+      </w:pPr>
+      <w:r>
+        <w:rPr>
+          <w:rFonts w:ascii="Segoe UI" w:hAnsi="Segoe UI"/>
+          <w:sz w:val="21"/>
+        </w:rPr>
+        <w:t>Dynamic Progress Computation: Delivery progress is automatically inferred as the weighted completion percentage of its linked tasks.</w:t>
+      </w:r>
+    </w:p>
+    <w:p>
+      <w:pPr>
+        <w:pStyle w:val="ListBullet"/>
+        <w:spacing w:before="0" w:after="60"/>
+        <w:ind w:left="360"/>
+      </w:pPr>
+      <w:r>
+        <w:rPr>
+          <w:rFonts w:ascii="Segoe UI" w:hAnsi="Segoe UI"/>
+          <w:sz w:val="21"/>
+        </w:rPr>
+        <w:t>GUI Screen Impact Analysis: Linking deliveries to GUI screens allows QA teams to instantly see which UI surfaces are affected by a deployment.</w:t>
+      </w:r>
+    </w:p>
+    <w:p>
+      <w:pPr>
+        <w:pStyle w:val="ListBullet"/>
+        <w:spacing w:before="0" w:after="60"/>
+        <w:ind w:left="360"/>
+      </w:pPr>
+      <w:r>
+        <w:rPr>
+          <w:rFonts w:ascii="Segoe UI" w:hAnsi="Segoe UI"/>
+          <w:sz w:val="21"/>
+        </w:rPr>
+        <w:t>Automatic Cross-Referencing: Navigating from a Delivery to a Task or vice-versa reveals complete linkage details in the respective flyout drawers.</w:t>
+      </w:r>
+    </w:p>
+    <w:p/>
+    <w:p>
+      <w:pPr>
+        <w:pStyle w:val="Heading2"/>
+        <w:keepNext/>
+        <w:spacing w:before="320" w:after="120"/>
+      </w:pPr>
+      <w:r>
+        <w:rPr>
+          <w:rFonts w:ascii="Segoe UI" w:hAnsi="Segoe UI"/>
+          <w:color w:val="1E9ED5"/>
+        </w:rPr>
+        <w:t>3.3  Visual Perspectives: Table Grid vs. Perspective Heatmap</w:t>
+      </w:r>
+    </w:p>
+    <w:p>
+      <w:pPr>
+        <w:spacing w:before="0" w:after="120"/>
+      </w:pPr>
+      <w:r>
+        <w:rPr>
+          <w:rFonts w:ascii="Segoe UI" w:hAnsi="Segoe UI"/>
+          <w:sz w:val="21"/>
+        </w:rPr>
+        <w:t>The Deliveries workstation offers two complementary visualization perspectives toggled seamlessly via the view toolbar:</w:t>
+      </w:r>
+    </w:p>
+    <w:tbl>
+      <w:tblPr>
+        <w:tblW w:type="auto" w:w="0"/>
+        <w:jc w:val="center"/>
+        <w:tblLook w:firstColumn="1" w:firstRow="1" w:lastColumn="0" w:lastRow="0" w:noHBand="0" w:noVBand="1" w:val="04A0"/>
+      </w:tblPr>
+      <w:tblGrid>
+        <w:gridCol w:w="9360"/>
+      </w:tblGrid>
+      <w:tr>
+        <w:tc>
+          <w:tcPr>
+            <w:tcW w:type="dxa" w:w="9360"/>
+            <w:shd w:val="clear" w:color="auto" w:fill="FFFFFF"/>
+            <w:tcBorders>
+              <w:top w:val="single" w:sz="4" w:color="E2E8F0"/>
+              <w:bottom w:val="single" w:sz="4" w:color="E2E8F0"/>
+              <w:left w:val="single" w:sz="4" w:color="E2E8F0"/>
+              <w:right w:val="single" w:sz="4" w:color="E2E8F0"/>
+            </w:tcBorders>
+          </w:tcPr>
+          <w:p>
+            <w:pPr>
+              <w:spacing w:before="120" w:after="120"/>
+              <w:jc w:val="center"/>
+            </w:pPr>
+            <w:r>
+              <w:drawing>
+                <wp:inline xmlns:a="http://schemas.openxmlformats.org/drawingml/2006/main" xmlns:pic="http://schemas.openxmlformats.org/drawingml/2006/picture">
+                  <wp:extent cx="5577840" cy="3137535"/>
+                  <wp:docPr id="3" name="Picture 3"/>
+                  <wp:cNvGraphicFramePr>
+                    <a:graphicFrameLocks noChangeAspect="1"/>
+                  </wp:cNvGraphicFramePr>
+                  <a:graphic>
+                    <a:graphicData uri="http://schemas.openxmlformats.org/drawingml/2006/picture">
+                      <pic:pic>
+                        <pic:nvPicPr>
+                          <pic:cNvPr id="0" name="02c_deliveries_heatmap.png"/>
+                          <pic:cNvPicPr/>
+                        </pic:nvPicPr>
+                        <pic:blipFill>
+                          <a:blip r:embed="rId11"/>
+                          <a:stretch>
+                            <a:fillRect/>
+                          </a:stretch>
+                        </pic:blipFill>
+                        <pic:spPr>
+                          <a:xfrm>
+                            <a:off x="0" y="0"/>
+                            <a:ext cx="5577840" cy="3137535"/>
+                          </a:xfrm>
+                          <a:prstGeom prst="rect"/>
+                        </pic:spPr>
+                      </pic:pic>
+                    </a:graphicData>
+                  </a:graphic>
+                </wp:inline>
+              </w:drawing>
+            </w:r>
+          </w:p>
+        </w:tc>
+      </w:tr>
+    </w:tbl>
+    <w:p>
+      <w:pPr>
+        <w:spacing w:before="80" w:after="280"/>
+        <w:jc w:val="center"/>
+      </w:pPr>
+      <w:r>
+        <w:rPr>
+          <w:rFonts w:ascii="Segoe UI" w:hAnsi="Segoe UI"/>
+          <w:i/>
+          <w:color w:val="6C757D"/>
+          <w:sz w:val="18"/>
+        </w:rPr>
+        <w:t>Figure 3.2 — Visual Perspective Heatmap: Pipeline matrix organizing software deliveries by milestone and environment</w:t>
+      </w:r>
+    </w:p>
+    <w:p>
+      <w:pPr>
+        <w:pStyle w:val="ListBullet"/>
+        <w:spacing w:before="0" w:after="60"/>
+        <w:ind w:left="360"/>
+      </w:pPr>
+      <w:r>
+        <w:rPr>
+          <w:rFonts w:ascii="Segoe UI" w:hAnsi="Segoe UI"/>
+          <w:sz w:val="21"/>
+        </w:rPr>
+        <w:t>Table Grid View: High-density tabular layout optimized for operational scanning, batch sorting, and column configuration.</w:t>
+      </w:r>
+    </w:p>
+    <w:p>
+      <w:pPr>
+        <w:pStyle w:val="ListBullet"/>
+        <w:spacing w:before="0" w:after="60"/>
+        <w:ind w:left="360"/>
+      </w:pPr>
+      <w:r>
+        <w:rPr>
+          <w:rFonts w:ascii="Segoe UI" w:hAnsi="Segoe UI"/>
+          <w:sz w:val="21"/>
+        </w:rPr>
+        <w:t>Visual Perspective Heatmap: Matrix layout clustering deliveries across Target Environments (DEV, QA, UAT, PROD) and Release Horizons, with health-colored milestone cards.</w:t>
+      </w:r>
+    </w:p>
+    <w:p>
+      <w:pPr>
+        <w:pStyle w:val="ListBullet"/>
+        <w:spacing w:before="0" w:after="60"/>
+        <w:ind w:left="360"/>
+      </w:pPr>
+      <w:r>
+        <w:rPr>
+          <w:rFonts w:ascii="Segoe UI" w:hAnsi="Segoe UI"/>
+          <w:sz w:val="21"/>
+        </w:rPr>
+        <w:t>Quick Filters: Live search bar, Status dropdown, Type filter, and Environment selector instantly filter both perspectives in real time.</w:t>
+      </w:r>
+    </w:p>
+    <w:p/>
+    <w:p>
+      <w:pPr>
+        <w:pStyle w:val="Heading2"/>
+        <w:keepNext/>
+        <w:spacing w:before="320" w:after="120"/>
+      </w:pPr>
+      <w:r>
+        <w:rPr>
+          <w:rFonts w:ascii="Segoe UI" w:hAnsi="Segoe UI"/>
+          <w:color w:val="1E9ED5"/>
+        </w:rPr>
+        <w:t>3.4  Slide-out Flyout Drawer &amp; Context Menu Operations</w:t>
+      </w:r>
+    </w:p>
+    <w:p>
+      <w:pPr>
+        <w:spacing w:before="0" w:after="120"/>
+      </w:pPr>
+      <w:r>
+        <w:rPr>
+          <w:rFonts w:ascii="Segoe UI" w:hAnsi="Segoe UI"/>
+          <w:sz w:val="21"/>
+        </w:rPr>
+        <w:t>Deep inspection and record modification are facilitated through ergonomic, accessible workflows:</w:t>
+      </w:r>
+    </w:p>
+    <w:tbl>
+      <w:tblPr>
+        <w:tblW w:type="auto" w:w="0"/>
+        <w:jc w:val="center"/>
+        <w:tblLook w:firstColumn="1" w:firstRow="1" w:lastColumn="0" w:lastRow="0" w:noHBand="0" w:noVBand="1" w:val="04A0"/>
+      </w:tblPr>
+      <w:tblGrid>
+        <w:gridCol w:w="9360"/>
+      </w:tblGrid>
+      <w:tr>
+        <w:tc>
+          <w:tcPr>
+            <w:tcW w:type="dxa" w:w="9360"/>
+            <w:shd w:val="clear" w:color="auto" w:fill="FFFFFF"/>
+            <w:tcBorders>
+              <w:top w:val="single" w:sz="4" w:color="E2E8F0"/>
+              <w:bottom w:val="single" w:sz="4" w:color="E2E8F0"/>
+              <w:left w:val="single" w:sz="4" w:color="E2E8F0"/>
+              <w:right w:val="single" w:sz="4" w:color="E2E8F0"/>
+            </w:tcBorders>
+          </w:tcPr>
+          <w:p>
+            <w:pPr>
+              <w:spacing w:before="120" w:after="120"/>
+              <w:jc w:val="center"/>
+            </w:pPr>
+            <w:r>
+              <w:drawing>
+                <wp:inline xmlns:a="http://schemas.openxmlformats.org/drawingml/2006/main" xmlns:pic="http://schemas.openxmlformats.org/drawingml/2006/picture">
+                  <wp:extent cx="5577840" cy="3137535"/>
+                  <wp:docPr id="4" name="Picture 4"/>
+                  <wp:cNvGraphicFramePr>
+                    <a:graphicFrameLocks noChangeAspect="1"/>
+                  </wp:cNvGraphicFramePr>
+                  <a:graphic>
+                    <a:graphicData uri="http://schemas.openxmlformats.org/drawingml/2006/picture">
+                      <pic:pic>
+                        <pic:nvPicPr>
+                          <pic:cNvPr id="0" name="11b_delivery_flyout.png"/>
+                          <pic:cNvPicPr/>
+                        </pic:nvPicPr>
+                        <pic:blipFill>
+                          <a:blip r:embed="rId12"/>
+                          <a:stretch>
+                            <a:fillRect/>
+                          </a:stretch>
+                        </pic:blipFill>
+                        <pic:spPr>
+                          <a:xfrm>
+                            <a:off x="0" y="0"/>
+                            <a:ext cx="5577840" cy="3137535"/>
+                          </a:xfrm>
+                          <a:prstGeom prst="rect"/>
+                        </pic:spPr>
+                      </pic:pic>
+                    </a:graphicData>
+                  </a:graphic>
+                </wp:inline>
+              </w:drawing>
+            </w:r>
+          </w:p>
+        </w:tc>
+      </w:tr>
+    </w:tbl>
+    <w:p>
+      <w:pPr>
+        <w:spacing w:before="80" w:after="280"/>
+        <w:jc w:val="center"/>
+      </w:pPr>
+      <w:r>
+        <w:rPr>
+          <w:rFonts w:ascii="Segoe UI" w:hAnsi="Segoe UI"/>
+          <w:i/>
+          <w:color w:val="6C757D"/>
+          <w:sz w:val="18"/>
+        </w:rPr>
+        <w:t>Figure 3.3 — Delivery Detail Flyout Drawer: Comprehensive inspection of linked tasks, GUI screens, dependencies, and audit history</w:t>
+      </w:r>
+    </w:p>
+    <w:p>
+      <w:pPr>
+        <w:pStyle w:val="ListBullet"/>
+        <w:spacing w:before="0" w:after="60"/>
+        <w:ind w:left="360"/>
+      </w:pPr>
+      <w:r>
+        <w:rPr>
+          <w:rFonts w:ascii="Segoe UI" w:hAnsi="Segoe UI"/>
+          <w:sz w:val="21"/>
+        </w:rPr>
+        <w:t>3-Dot Action Menu: Every table row features an accessible ellipsis menu offering 'View Details', 'Edit Delivery', and 'Delete'.</w:t>
+      </w:r>
+    </w:p>
+    <w:p>
+      <w:pPr>
+        <w:pStyle w:val="ListBullet"/>
+        <w:spacing w:before="0" w:after="60"/>
+        <w:ind w:left="360"/>
+      </w:pPr>
+      <w:r>
+        <w:rPr>
+          <w:rFonts w:ascii="Segoe UI" w:hAnsi="Segoe UI"/>
+          <w:sz w:val="21"/>
+        </w:rPr>
+        <w:t>Right-Click Context Menu: Right-clicking any row triggers a context menu with identical high-speed shortcuts, eliminating visual clutter.</w:t>
+      </w:r>
+    </w:p>
+    <w:p>
+      <w:pPr>
+        <w:pStyle w:val="ListBullet"/>
+        <w:spacing w:before="0" w:after="60"/>
+        <w:ind w:left="360"/>
+      </w:pPr>
+      <w:r>
+        <w:rPr>
+          <w:rFonts w:ascii="Segoe UI" w:hAnsi="Segoe UI"/>
+          <w:sz w:val="21"/>
+        </w:rPr>
+        <w:t>Slide-out Flyout Drawer: Clicking any delivery opens an animated flyout drawer presenting metadata, progress gauges, linked task list with live status pills, screen badges, and audit history.</w:t>
+      </w:r>
+    </w:p>
+    <w:p/>
+    <w:p>
+      <w:pPr>
+        <w:pStyle w:val="Heading2"/>
+        <w:keepNext/>
+        <w:spacing w:before="320" w:after="120"/>
+      </w:pPr>
+      <w:r>
+        <w:rPr>
+          <w:rFonts w:ascii="Segoe UI" w:hAnsi="Segoe UI"/>
+          <w:color w:val="1E9ED5"/>
+        </w:rPr>
+        <w:t>3.5  5-Strategy Intelligent Column Autofit Engine</w:t>
+      </w:r>
+    </w:p>
+    <w:p>
+      <w:pPr>
+        <w:spacing w:before="0" w:after="120"/>
+      </w:pPr>
+      <w:r>
+        <w:rPr>
+          <w:rFonts w:ascii="Segoe UI" w:hAnsi="Segoe UI"/>
+          <w:sz w:val="21"/>
+        </w:rPr>
+        <w:t>ProjectPulse features a proprietary multi-strategy column width optimization engine that adapts the Deliveries table to any screen resolution and content length:</w:t>
+      </w:r>
+    </w:p>
+    <w:tbl>
+      <w:tblPr>
+        <w:tblW w:type="auto" w:w="0"/>
+        <w:jc w:val="center"/>
+        <w:tblLook w:firstColumn="1" w:firstRow="1" w:lastColumn="0" w:lastRow="0" w:noHBand="0" w:noVBand="1" w:val="04A0"/>
+      </w:tblPr>
+      <w:tblGrid>
+        <w:gridCol w:w="3120"/>
+        <w:gridCol w:w="3120"/>
+        <w:gridCol w:w="3120"/>
+      </w:tblGrid>
+      <w:tr>
+        <w:tc>
+          <w:tcPr>
+            <w:tcW w:type="dxa" w:w="2304"/>
+            <w:shd w:val="clear" w:color="auto" w:fill="0D1B2A"/>
+            <w:tcMar>
+              <w:top w:w="120" w:type="dxa"/>
+              <w:bottom w:w="120" w:type="dxa"/>
+              <w:left w:w="180" w:type="dxa"/>
+              <w:right w:w="180" w:type="dxa"/>
+            </w:tcMar>
+            <w:tcBorders>
+              <w:top w:val="none"/>
+              <w:bottom w:val="single" w:sz="12" w:color="00C2A8"/>
+              <w:left w:val="none"/>
+              <w:right w:val="none"/>
+            </w:tcBorders>
+          </w:tcPr>
+          <w:p>
+            <w:pPr>
+              <w:spacing w:before="40" w:after="40"/>
+              <w:jc w:val="left"/>
+            </w:pPr>
+            <w:r>
+              <w:rPr>
+                <w:rFonts w:ascii="Segoe UI" w:hAnsi="Segoe UI"/>
+                <w:b/>
+                <w:color w:val="FFFFFF"/>
+                <w:sz w:val="19"/>
+              </w:rPr>
+              <w:t>Strategy</w:t>
+            </w:r>
+          </w:p>
+        </w:tc>
+        <w:tc>
+          <w:tcPr>
+            <w:tcW w:type="dxa" w:w="4608"/>
+            <w:shd w:val="clear" w:color="auto" w:fill="0D1B2A"/>
+            <w:tcMar>
+              <w:top w:w="120" w:type="dxa"/>
+              <w:bottom w:w="120" w:type="dxa"/>
+              <w:left w:w="180" w:type="dxa"/>
+              <w:right w:w="180" w:type="dxa"/>
+            </w:tcMar>
+            <w:tcBorders>
+              <w:top w:val="none"/>
+              <w:bottom w:val="single" w:sz="12" w:color="00C2A8"/>
+              <w:left w:val="none"/>
+              <w:right w:val="none"/>
+            </w:tcBorders>
+          </w:tcPr>
+          <w:p>
+            <w:pPr>
+              <w:spacing w:before="40" w:after="40"/>
+              <w:jc w:val="left"/>
+            </w:pPr>
+            <w:r>
+              <w:rPr>
+                <w:rFonts w:ascii="Segoe UI" w:hAnsi="Segoe UI"/>
+                <w:b/>
+                <w:color w:val="FFFFFF"/>
+                <w:sz w:val="19"/>
+              </w:rPr>
+              <w:t>Algorithm</w:t>
+            </w:r>
+          </w:p>
+        </w:tc>
+        <w:tc>
+          <w:tcPr>
+            <w:tcW w:type="dxa" w:w="2592"/>
+            <w:shd w:val="clear" w:color="auto" w:fill="0D1B2A"/>
+            <w:tcMar>
+              <w:top w:w="120" w:type="dxa"/>
+              <w:bottom w:w="120" w:type="dxa"/>
+              <w:left w:w="180" w:type="dxa"/>
+              <w:right w:w="180" w:type="dxa"/>
+            </w:tcMar>
+            <w:tcBorders>
+              <w:top w:val="none"/>
+              <w:bottom w:val="single" w:sz="12" w:color="00C2A8"/>
+              <w:left w:val="none"/>
+              <w:right w:val="none"/>
+            </w:tcBorders>
+          </w:tcPr>
+          <w:p>
+            <w:pPr>
+              <w:spacing w:before="40" w:after="40"/>
+              <w:jc w:val="left"/>
+            </w:pPr>
+            <w:r>
+              <w:rPr>
+                <w:rFonts w:ascii="Segoe UI" w:hAnsi="Segoe UI"/>
+                <w:b/>
+                <w:color w:val="FFFFFF"/>
+                <w:sz w:val="19"/>
+              </w:rPr>
+              <w:t>Best For</w:t>
+            </w:r>
+          </w:p>
+        </w:tc>
+      </w:tr>
+      <w:tr>
+        <w:tc>
+          <w:tcPr>
+            <w:tcW w:type="dxa" w:w="2304"/>
+            <w:shd w:val="clear" w:color="auto" w:fill="F8FAFC"/>
+            <w:tcMar>
+              <w:top w:w="100" w:type="dxa"/>
+              <w:bottom w:w="100" w:type="dxa"/>
+              <w:left w:w="150" w:type="dxa"/>
+              <w:right w:w="150" w:type="dxa"/>
+            </w:tcMar>
+            <w:tcBorders>
+              <w:top w:val="none"/>
+              <w:bottom w:val="single" w:sz="4" w:color="E2E8F0"/>
+              <w:left w:val="none"/>
+              <w:right w:val="none"/>
+            </w:tcBorders>
+          </w:tcPr>
+          <w:p>
+            <w:pPr>
+              <w:spacing w:before="40" w:after="40"/>
+              <w:jc w:val="left"/>
+            </w:pPr>
+            <w:r>
+              <w:rPr>
+                <w:rFonts w:ascii="Segoe UI" w:hAnsi="Segoe UI"/>
+                <w:color w:val="1C1C1E"/>
+                <w:sz w:val="19"/>
+              </w:rPr>
+              <w:t>Content-Aware Autofit</w:t>
+            </w:r>
+          </w:p>
+        </w:tc>
+        <w:tc>
+          <w:tcPr>
+            <w:tcW w:type="dxa" w:w="4608"/>
+            <w:shd w:val="clear" w:color="auto" w:fill="F8FAFC"/>
+            <w:tcMar>
+              <w:top w:w="100" w:type="dxa"/>
+              <w:bottom w:w="100" w:type="dxa"/>
+              <w:left w:w="150" w:type="dxa"/>
+              <w:right w:w="150" w:type="dxa"/>
+            </w:tcMar>
+            <w:tcBorders>
+              <w:top w:val="none"/>
+              <w:bottom w:val="single" w:sz="4" w:color="E2E8F0"/>
+              <w:left w:val="none"/>
+              <w:right w:val="none"/>
+            </w:tcBorders>
+          </w:tcPr>
+          <w:p>
+            <w:pPr>
+              <w:spacing w:before="40" w:after="40"/>
+              <w:jc w:val="left"/>
+            </w:pPr>
+            <w:r>
+              <w:rPr>
+                <w:rFonts w:ascii="Segoe UI" w:hAnsi="Segoe UI"/>
+                <w:color w:val="1C1C1E"/>
+                <w:sz w:val="19"/>
+              </w:rPr>
+              <w:t>Measures rendered DOM canvas text width for headers and cell content with safety padding.</w:t>
+            </w:r>
+          </w:p>
+        </w:tc>
+        <w:tc>
+          <w:tcPr>
+            <w:tcW w:type="dxa" w:w="2592"/>
+            <w:shd w:val="clear" w:color="auto" w:fill="F8FAFC"/>
+            <w:tcMar>
+              <w:top w:w="100" w:type="dxa"/>
+              <w:bottom w:w="100" w:type="dxa"/>
+              <w:left w:w="150" w:type="dxa"/>
+              <w:right w:w="150" w:type="dxa"/>
+            </w:tcMar>
+            <w:tcBorders>
+              <w:top w:val="none"/>
+              <w:bottom w:val="single" w:sz="4" w:color="E2E8F0"/>
+              <w:left w:val="none"/>
+              <w:right w:val="none"/>
+            </w:tcBorders>
+          </w:tcPr>
+          <w:p>
+            <w:pPr>
+              <w:spacing w:before="40" w:after="40"/>
+              <w:jc w:val="left"/>
+            </w:pPr>
+            <w:r>
+              <w:rPr>
+                <w:rFonts w:ascii="Segoe UI" w:hAnsi="Segoe UI"/>
+                <w:color w:val="1C1C1E"/>
+                <w:sz w:val="19"/>
+              </w:rPr>
+              <w:t>Dense datasets with varying text lengths.</w:t>
+            </w:r>
+          </w:p>
+        </w:tc>
+      </w:tr>
+      <w:tr>
+        <w:tc>
+          <w:tcPr>
+            <w:tcW w:type="dxa" w:w="2304"/>
+            <w:shd w:val="clear" w:color="auto" w:fill="FFFFFF"/>
+            <w:tcMar>
+              <w:top w:w="100" w:type="dxa"/>
+              <w:bottom w:w="100" w:type="dxa"/>
+              <w:left w:w="150" w:type="dxa"/>
+              <w:right w:w="150" w:type="dxa"/>
+            </w:tcMar>
+            <w:tcBorders>
+              <w:top w:val="none"/>
+              <w:bottom w:val="single" w:sz="4" w:color="E2E8F0"/>
+              <w:left w:val="none"/>
+              <w:right w:val="none"/>
+            </w:tcBorders>
+          </w:tcPr>
+          <w:p>
+            <w:pPr>
+              <w:spacing w:before="40" w:after="40"/>
+              <w:jc w:val="left"/>
+            </w:pPr>
+            <w:r>
+              <w:rPr>
+                <w:rFonts w:ascii="Segoe UI" w:hAnsi="Segoe UI"/>
+                <w:color w:val="1C1C1E"/>
+                <w:sz w:val="19"/>
+              </w:rPr>
+              <w:t>Proportional Flex</w:t>
+            </w:r>
+          </w:p>
+        </w:tc>
+        <w:tc>
+          <w:tcPr>
+            <w:tcW w:type="dxa" w:w="4608"/>
+            <w:shd w:val="clear" w:color="auto" w:fill="FFFFFF"/>
+            <w:tcMar>
+              <w:top w:w="100" w:type="dxa"/>
+              <w:bottom w:w="100" w:type="dxa"/>
+              <w:left w:w="150" w:type="dxa"/>
+              <w:right w:w="150" w:type="dxa"/>
+            </w:tcMar>
+            <w:tcBorders>
+              <w:top w:val="none"/>
+              <w:bottom w:val="single" w:sz="4" w:color="E2E8F0"/>
+              <w:left w:val="none"/>
+              <w:right w:val="none"/>
+            </w:tcBorders>
+          </w:tcPr>
+          <w:p>
+            <w:pPr>
+              <w:spacing w:before="40" w:after="40"/>
+              <w:jc w:val="left"/>
+            </w:pPr>
+            <w:r>
+              <w:rPr>
+                <w:rFonts w:ascii="Segoe UI" w:hAnsi="Segoe UI"/>
+                <w:color w:val="1C1C1E"/>
+                <w:sz w:val="19"/>
+              </w:rPr>
+              <w:t>Allocates column widths proportionally based on assigned flex factors.</w:t>
+            </w:r>
+          </w:p>
+        </w:tc>
+        <w:tc>
+          <w:tcPr>
+            <w:tcW w:type="dxa" w:w="2592"/>
+            <w:shd w:val="clear" w:color="auto" w:fill="FFFFFF"/>
+            <w:tcMar>
+              <w:top w:w="100" w:type="dxa"/>
+              <w:bottom w:w="100" w:type="dxa"/>
+              <w:left w:w="150" w:type="dxa"/>
+              <w:right w:w="150" w:type="dxa"/>
+            </w:tcMar>
+            <w:tcBorders>
+              <w:top w:val="none"/>
+              <w:bottom w:val="single" w:sz="4" w:color="E2E8F0"/>
+              <w:left w:val="none"/>
+              <w:right w:val="none"/>
+            </w:tcBorders>
+          </w:tcPr>
+          <w:p>
+            <w:pPr>
+              <w:spacing w:before="40" w:after="40"/>
+              <w:jc w:val="left"/>
+            </w:pPr>
+            <w:r>
+              <w:rPr>
+                <w:rFonts w:ascii="Segoe UI" w:hAnsi="Segoe UI"/>
+                <w:color w:val="1C1C1E"/>
+                <w:sz w:val="19"/>
+              </w:rPr>
+              <w:t>Standard widescreen monitors (1920×1080).</w:t>
+            </w:r>
+          </w:p>
+        </w:tc>
+      </w:tr>
+      <w:tr>
+        <w:tc>
+          <w:tcPr>
+            <w:tcW w:type="dxa" w:w="2304"/>
+            <w:shd w:val="clear" w:color="auto" w:fill="F8FAFC"/>
+            <w:tcMar>
+              <w:top w:w="100" w:type="dxa"/>
+              <w:bottom w:w="100" w:type="dxa"/>
+              <w:left w:w="150" w:type="dxa"/>
+              <w:right w:w="150" w:type="dxa"/>
+            </w:tcMar>
+            <w:tcBorders>
+              <w:top w:val="none"/>
+              <w:bottom w:val="single" w:sz="4" w:color="E2E8F0"/>
+              <w:left w:val="none"/>
+              <w:right w:val="none"/>
+            </w:tcBorders>
+          </w:tcPr>
+          <w:p>
+            <w:pPr>
+              <w:spacing w:before="40" w:after="40"/>
+              <w:jc w:val="left"/>
+            </w:pPr>
+            <w:r>
+              <w:rPr>
+                <w:rFonts w:ascii="Segoe UI" w:hAnsi="Segoe UI"/>
+                <w:color w:val="1C1C1E"/>
+                <w:sz w:val="19"/>
+              </w:rPr>
+              <w:t>Compact / Min-Width</w:t>
+            </w:r>
+          </w:p>
+        </w:tc>
+        <w:tc>
+          <w:tcPr>
+            <w:tcW w:type="dxa" w:w="4608"/>
+            <w:shd w:val="clear" w:color="auto" w:fill="F8FAFC"/>
+            <w:tcMar>
+              <w:top w:w="100" w:type="dxa"/>
+              <w:bottom w:w="100" w:type="dxa"/>
+              <w:left w:w="150" w:type="dxa"/>
+              <w:right w:w="150" w:type="dxa"/>
+            </w:tcMar>
+            <w:tcBorders>
+              <w:top w:val="none"/>
+              <w:bottom w:val="single" w:sz="4" w:color="E2E8F0"/>
+              <w:left w:val="none"/>
+              <w:right w:val="none"/>
+            </w:tcBorders>
+          </w:tcPr>
+          <w:p>
+            <w:pPr>
+              <w:spacing w:before="40" w:after="40"/>
+              <w:jc w:val="left"/>
+            </w:pPr>
+            <w:r>
+              <w:rPr>
+                <w:rFonts w:ascii="Segoe UI" w:hAnsi="Segoe UI"/>
+                <w:color w:val="1C1C1E"/>
+                <w:sz w:val="19"/>
+              </w:rPr>
+              <w:t>Enforces strict minimum thresholds to prevent content overflow or horizontal scrolling.</w:t>
+            </w:r>
+          </w:p>
+        </w:tc>
+        <w:tc>
+          <w:tcPr>
+            <w:tcW w:type="dxa" w:w="2592"/>
+            <w:shd w:val="clear" w:color="auto" w:fill="F8FAFC"/>
+            <w:tcMar>
+              <w:top w:w="100" w:type="dxa"/>
+              <w:bottom w:w="100" w:type="dxa"/>
+              <w:left w:w="150" w:type="dxa"/>
+              <w:right w:w="150" w:type="dxa"/>
+            </w:tcMar>
+            <w:tcBorders>
+              <w:top w:val="none"/>
+              <w:bottom w:val="single" w:sz="4" w:color="E2E8F0"/>
+              <w:left w:val="none"/>
+              <w:right w:val="none"/>
+            </w:tcBorders>
+          </w:tcPr>
+          <w:p>
+            <w:pPr>
+              <w:spacing w:before="40" w:after="40"/>
+              <w:jc w:val="left"/>
+            </w:pPr>
+            <w:r>
+              <w:rPr>
+                <w:rFonts w:ascii="Segoe UI" w:hAnsi="Segoe UI"/>
+                <w:color w:val="1C1C1E"/>
+                <w:sz w:val="19"/>
+              </w:rPr>
+              <w:t>Laptops and tablet displays.</w:t>
+            </w:r>
+          </w:p>
+        </w:tc>
+      </w:tr>
+      <w:tr>
+        <w:tc>
+          <w:tcPr>
+            <w:tcW w:type="dxa" w:w="2304"/>
+            <w:shd w:val="clear" w:color="auto" w:fill="FFFFFF"/>
+            <w:tcMar>
+              <w:top w:w="100" w:type="dxa"/>
+              <w:bottom w:w="100" w:type="dxa"/>
+              <w:left w:w="150" w:type="dxa"/>
+              <w:right w:w="150" w:type="dxa"/>
+            </w:tcMar>
+            <w:tcBorders>
+              <w:top w:val="none"/>
+              <w:bottom w:val="single" w:sz="4" w:color="E2E8F0"/>
+              <w:left w:val="none"/>
+              <w:right w:val="none"/>
+            </w:tcBorders>
+          </w:tcPr>
+          <w:p>
+            <w:pPr>
+              <w:spacing w:before="40" w:after="40"/>
+              <w:jc w:val="left"/>
+            </w:pPr>
+            <w:r>
+              <w:rPr>
+                <w:rFonts w:ascii="Segoe UI" w:hAnsi="Segoe UI"/>
+                <w:color w:val="1C1C1E"/>
+                <w:sz w:val="19"/>
+              </w:rPr>
+              <w:t>Fixed Enterprise Grid</w:t>
+            </w:r>
+          </w:p>
+        </w:tc>
+        <w:tc>
+          <w:tcPr>
+            <w:tcW w:type="dxa" w:w="4608"/>
+            <w:shd w:val="clear" w:color="auto" w:fill="FFFFFF"/>
+            <w:tcMar>
+              <w:top w:w="100" w:type="dxa"/>
+              <w:bottom w:w="100" w:type="dxa"/>
+              <w:left w:w="150" w:type="dxa"/>
+              <w:right w:w="150" w:type="dxa"/>
+            </w:tcMar>
+            <w:tcBorders>
+              <w:top w:val="none"/>
+              <w:bottom w:val="single" w:sz="4" w:color="E2E8F0"/>
+              <w:left w:val="none"/>
+              <w:right w:val="none"/>
+            </w:tcBorders>
+          </w:tcPr>
+          <w:p>
+            <w:pPr>
+              <w:spacing w:before="40" w:after="40"/>
+              <w:jc w:val="left"/>
+            </w:pPr>
+            <w:r>
+              <w:rPr>
+                <w:rFonts w:ascii="Segoe UI" w:hAnsi="Segoe UI"/>
+                <w:color w:val="1C1C1E"/>
+                <w:sz w:val="19"/>
+              </w:rPr>
+              <w:t>Applies fixed, standardized column dimensions for consistent enterprise printing.</w:t>
+            </w:r>
+          </w:p>
+        </w:tc>
+        <w:tc>
+          <w:tcPr>
+            <w:tcW w:type="dxa" w:w="2592"/>
+            <w:shd w:val="clear" w:color="auto" w:fill="FFFFFF"/>
+            <w:tcMar>
+              <w:top w:w="100" w:type="dxa"/>
+              <w:bottom w:w="100" w:type="dxa"/>
+              <w:left w:w="150" w:type="dxa"/>
+              <w:right w:w="150" w:type="dxa"/>
+            </w:tcMar>
+            <w:tcBorders>
+              <w:top w:val="none"/>
+              <w:bottom w:val="single" w:sz="4" w:color="E2E8F0"/>
+              <w:left w:val="none"/>
+              <w:right w:val="none"/>
+            </w:tcBorders>
+          </w:tcPr>
+          <w:p>
+            <w:pPr>
+              <w:spacing w:before="40" w:after="40"/>
+              <w:jc w:val="left"/>
+            </w:pPr>
+            <w:r>
+              <w:rPr>
+                <w:rFonts w:ascii="Segoe UI" w:hAnsi="Segoe UI"/>
+                <w:color w:val="1C1C1E"/>
+                <w:sz w:val="19"/>
+              </w:rPr>
+              <w:t>Export preparation and formal review.</w:t>
+            </w:r>
+          </w:p>
+        </w:tc>
+      </w:tr>
+      <w:tr>
+        <w:tc>
+          <w:tcPr>
+            <w:tcW w:type="dxa" w:w="2304"/>
+            <w:shd w:val="clear" w:color="auto" w:fill="F8FAFC"/>
+            <w:tcMar>
+              <w:top w:w="100" w:type="dxa"/>
+              <w:bottom w:w="100" w:type="dxa"/>
+              <w:left w:w="150" w:type="dxa"/>
+              <w:right w:w="150" w:type="dxa"/>
+            </w:tcMar>
+            <w:tcBorders>
+              <w:top w:val="none"/>
+              <w:bottom w:val="single" w:sz="4" w:color="E2E8F0"/>
+              <w:left w:val="none"/>
+              <w:right w:val="none"/>
+            </w:tcBorders>
+          </w:tcPr>
+          <w:p>
+            <w:pPr>
+              <w:spacing w:before="40" w:after="40"/>
+              <w:jc w:val="left"/>
+            </w:pPr>
+            <w:r>
+              <w:rPr>
+                <w:rFonts w:ascii="Segoe UI" w:hAnsi="Segoe UI"/>
+                <w:color w:val="1C1C1E"/>
+                <w:sz w:val="19"/>
+              </w:rPr>
+              <w:t>Saved Preference Mode</w:t>
+            </w:r>
+          </w:p>
+        </w:tc>
+        <w:tc>
+          <w:tcPr>
+            <w:tcW w:type="dxa" w:w="4608"/>
+            <w:shd w:val="clear" w:color="auto" w:fill="F8FAFC"/>
+            <w:tcMar>
+              <w:top w:w="100" w:type="dxa"/>
+              <w:bottom w:w="100" w:type="dxa"/>
+              <w:left w:w="150" w:type="dxa"/>
+              <w:right w:w="150" w:type="dxa"/>
+            </w:tcMar>
+            <w:tcBorders>
+              <w:top w:val="none"/>
+              <w:bottom w:val="single" w:sz="4" w:color="E2E8F0"/>
+              <w:left w:val="none"/>
+              <w:right w:val="none"/>
+            </w:tcBorders>
+          </w:tcPr>
+          <w:p>
+            <w:pPr>
+              <w:spacing w:before="40" w:after="40"/>
+              <w:jc w:val="left"/>
+            </w:pPr>
+            <w:r>
+              <w:rPr>
+                <w:rFonts w:ascii="Segoe UI" w:hAnsi="Segoe UI"/>
+                <w:color w:val="1C1C1E"/>
+                <w:sz w:val="19"/>
+              </w:rPr>
+              <w:t>Restores user-customized drag-resized widths stored in localStorage.</w:t>
+            </w:r>
+          </w:p>
+        </w:tc>
+        <w:tc>
+          <w:tcPr>
+            <w:tcW w:type="dxa" w:w="2592"/>
+            <w:shd w:val="clear" w:color="auto" w:fill="F8FAFC"/>
+            <w:tcMar>
+              <w:top w:w="100" w:type="dxa"/>
+              <w:bottom w:w="100" w:type="dxa"/>
+              <w:left w:w="150" w:type="dxa"/>
+              <w:right w:w="150" w:type="dxa"/>
+            </w:tcMar>
+            <w:tcBorders>
+              <w:top w:val="none"/>
+              <w:bottom w:val="single" w:sz="4" w:color="E2E8F0"/>
+              <w:left w:val="none"/>
+              <w:right w:val="none"/>
+            </w:tcBorders>
+          </w:tcPr>
+          <w:p>
+            <w:pPr>
+              <w:spacing w:before="40" w:after="40"/>
+              <w:jc w:val="left"/>
+            </w:pPr>
+            <w:r>
+              <w:rPr>
+                <w:rFonts w:ascii="Segoe UI" w:hAnsi="Segoe UI"/>
+                <w:color w:val="1C1C1E"/>
+                <w:sz w:val="19"/>
+              </w:rPr>
+              <w:t>Personalized power-user workflows.</w:t>
+            </w:r>
+          </w:p>
+        </w:tc>
+      </w:tr>
+    </w:tbl>
+    <w:p>
+      <w:pPr>
+        <w:spacing w:after="160"/>
+      </w:pPr>
+    </w:p>
+    <w:p>
+      <w:pPr>
+        <w:pStyle w:val="Heading2"/>
+        <w:keepNext/>
+        <w:spacing w:before="320" w:after="120"/>
+      </w:pPr>
+      <w:r>
+        <w:rPr>
+          <w:rFonts w:ascii="Segoe UI" w:hAnsi="Segoe UI"/>
+          <w:color w:val="1E9ED5"/>
+        </w:rPr>
+        <w:t>3.6  Bidirectional Excel Synchronization</w:t>
+      </w:r>
+    </w:p>
+    <w:p>
+      <w:pPr>
+        <w:spacing w:before="0" w:after="120"/>
+      </w:pPr>
+      <w:r>
+        <w:rPr>
+          <w:rFonts w:ascii="Segoe UI" w:hAnsi="Segoe UI"/>
+          <w:sz w:val="21"/>
+        </w:rPr>
+        <w:t>The Deliveries module is fully integrated into ProjectPulse's Excel engine (PulseExcel.buildDeliveriesSheet). Exporting to Excel generates a dedicated 'Deliveries' worksheet complete with enterprise styling, status-coded fill colors, ALM/PDN numbers, linked task arrays, and environment markers. Importing an updated workbook flawlessly parses delivery records, synchronizing changes without data loss.</w:t>
+      </w:r>
+    </w:p>
+    <w:tbl>
+      <w:tblPr>
+        <w:tblW w:type="auto" w:w="0"/>
+        <w:jc w:val="center"/>
+        <w:tblLook w:firstColumn="1" w:firstRow="1" w:lastColumn="0" w:lastRow="0" w:noHBand="0" w:noVBand="1" w:val="04A0"/>
+      </w:tblPr>
+      <w:tblGrid>
+        <w:gridCol w:w="9360"/>
+      </w:tblGrid>
+      <w:tr>
+        <w:tc>
+          <w:tcPr>
+            <w:tcW w:type="dxa" w:w="9360"/>
+            <w:shd w:val="clear" w:color="auto" w:fill="E9F7EF"/>
+            <w:tcMar>
+              <w:top w:w="120" w:type="dxa"/>
+              <w:bottom w:w="120" w:type="dxa"/>
+              <w:left w:w="180" w:type="dxa"/>
+              <w:right w:w="180" w:type="dxa"/>
+            </w:tcMar>
+            <w:tcBorders>
+              <w:top w:val="none"/>
+              <w:bottom w:val="none"/>
+              <w:left w:val="single" w:sz="28" w:color="1E8449"/>
+              <w:right w:val="none"/>
+            </w:tcBorders>
+          </w:tcPr>
+          <w:p>
+            <w:pPr>
+              <w:spacing w:before="40" w:after="40" w:line="276" w:lineRule="auto"/>
+            </w:pPr>
+            <w:r>
+              <w:rPr>
+                <w:rFonts w:ascii="Segoe UI" w:hAnsi="Segoe UI"/>
+                <w:b/>
+                <w:color w:val="145A32"/>
+                <w:sz w:val="19"/>
+              </w:rPr>
+              <w:t xml:space="preserve">💡 TIP  </w:t>
+            </w:r>
+          </w:p>
+          <w:p>
+            <w:pPr>
+              <w:spacing w:before="40" w:after="40" w:line="276" w:lineRule="auto"/>
+            </w:pPr>
+            <w:r>
+              <w:rPr>
+                <w:rFonts w:ascii="Segoe UI" w:hAnsi="Segoe UI"/>
+                <w:color w:val="1C1C1E"/>
+                <w:sz w:val="19"/>
+              </w:rPr>
+              <w:t>Deliveries that are overdue or marked 'Blocked' automatically propagate their risk rating to the Executive Overview Health Index. Ensuring deliveries are linked to verified WBS tasks guarantees 100% schedule alignment across the organization.</w:t>
+            </w:r>
+          </w:p>
+        </w:tc>
+      </w:tr>
+    </w:tbl>
+    <w:p>
+      <w:pPr>
+        <w:spacing w:after="80"/>
+      </w:pPr>
+    </w:p>
+    <w:p>
+      <w:r>
+        <w:br w:type="page"/>
+      </w:r>
+    </w:p>
+    <w:p>
+      <w:pPr>
+        <w:pStyle w:val="Heading1"/>
+        <w:keepNext/>
+        <w:spacing w:before="480" w:after="160"/>
+      </w:pPr>
+      <w:r>
+        <w:rPr>
+          <w:rFonts w:ascii="Segoe UI" w:hAnsi="Segoe UI"/>
+          <w:color w:val="0D1B2A"/>
+        </w:rPr>
+        <w:t>4  Hierarchical Task Matrix &amp; Work Breakdown Structure</w:t>
+      </w:r>
+    </w:p>
+    <w:p>
+      <w:pPr>
+        <w:pBdr>
+          <w:bottom w:val="single" w:sz="6" w:space="1" w:color="00C2A8"/>
+        </w:pBdr>
+        <w:spacing w:before="0" w:after="120"/>
+      </w:pPr>
+    </w:p>
+    <w:p>
+      <w:pPr>
+        <w:spacing w:before="0" w:after="160"/>
+      </w:pPr>
+      <w:r>
+        <w:rPr>
+          <w:rFonts w:ascii="Segoe UI" w:hAnsi="Segoe UI"/>
+          <w:sz w:val="21"/>
+        </w:rPr>
+        <w:t>The Hierarchical Task Matrix is the operational work breakdown structure (WBS) backbone of ProjectPulse — a high-density, spreadsheet-style task grid that supports multi-level parent-child hierarchies, inline editing, dependency mapping, effort estimation, and real-time status tracking. Every deliverable, epic, task, and subtask in the project lives in this view.</w:t>
+      </w:r>
+    </w:p>
+    <w:tbl>
+      <w:tblPr>
+        <w:tblW w:type="auto" w:w="0"/>
+        <w:jc w:val="center"/>
+        <w:tblLook w:firstColumn="1" w:firstRow="1" w:lastColumn="0" w:lastRow="0" w:noHBand="0" w:noVBand="1" w:val="04A0"/>
+      </w:tblPr>
+      <w:tblGrid>
+        <w:gridCol w:w="9360"/>
+      </w:tblGrid>
+      <w:tr>
+        <w:tc>
+          <w:tcPr>
+            <w:tcW w:type="dxa" w:w="9360"/>
+            <w:shd w:val="clear" w:color="auto" w:fill="FFFFFF"/>
+            <w:tcBorders>
+              <w:top w:val="single" w:sz="4" w:color="E2E8F0"/>
+              <w:bottom w:val="single" w:sz="4" w:color="E2E8F0"/>
+              <w:left w:val="single" w:sz="4" w:color="E2E8F0"/>
+              <w:right w:val="single" w:sz="4" w:color="E2E8F0"/>
+            </w:tcBorders>
+          </w:tcPr>
+          <w:p>
+            <w:pPr>
+              <w:spacing w:before="120" w:after="120"/>
+              <w:jc w:val="center"/>
+            </w:pPr>
+            <w:r>
+              <w:drawing>
+                <wp:inline xmlns:a="http://schemas.openxmlformats.org/drawingml/2006/main" xmlns:pic="http://schemas.openxmlformats.org/drawingml/2006/picture">
+                  <wp:extent cx="5577840" cy="3137535"/>
+                  <wp:docPr id="5" name="Picture 5"/>
+                  <wp:cNvGraphicFramePr>
+                    <a:graphicFrameLocks noChangeAspect="1"/>
+                  </wp:cNvGraphicFramePr>
+                  <a:graphic>
+                    <a:graphicData uri="http://schemas.openxmlformats.org/drawingml/2006/picture">
+                      <pic:pic>
+                        <pic:nvPicPr>
+                          <pic:cNvPr id="0" name="02_delivery_matrix.png"/>
+                          <pic:cNvPicPr/>
+                        </pic:nvPicPr>
+                        <pic:blipFill>
+                          <a:blip r:embed="rId13"/>
+                          <a:stretch>
+                            <a:fillRect/>
+                          </a:stretch>
+                        </pic:blipFill>
+                        <pic:spPr>
+                          <a:xfrm>
+                            <a:off x="0" y="0"/>
+                            <a:ext cx="5577840" cy="3137535"/>
+                          </a:xfrm>
+                          <a:prstGeom prst="rect"/>
+                        </pic:spPr>
+                      </pic:pic>
+                    </a:graphicData>
+                  </a:graphic>
+                </wp:inline>
+              </w:drawing>
+            </w:r>
+          </w:p>
+        </w:tc>
+      </w:tr>
+    </w:tbl>
+    <w:p>
+      <w:pPr>
+        <w:spacing w:before="80" w:after="280"/>
+        <w:jc w:val="center"/>
+      </w:pPr>
+      <w:r>
+        <w:rPr>
+          <w:rFonts w:ascii="Segoe UI" w:hAnsi="Segoe UI"/>
+          <w:i/>
+          <w:color w:val="6C757D"/>
+          <w:sz w:val="18"/>
+        </w:rPr>
+        <w:t>Figure 4.1 — Hierarchical Task Matrix showing parent tasks, child subtasks, status pills, and inline controls</w:t>
+      </w:r>
+    </w:p>
+    <w:p>
+      <w:pPr>
+        <w:pStyle w:val="Heading2"/>
+        <w:keepNext/>
+        <w:spacing w:before="320" w:after="120"/>
+      </w:pPr>
+      <w:r>
+        <w:rPr>
+          <w:rFonts w:ascii="Segoe UI" w:hAnsi="Segoe UI"/>
+          <w:color w:val="1E9ED5"/>
+        </w:rPr>
+        <w:t>4.1  Parent-Child Task Hierarchies</w:t>
       </w:r>
     </w:p>
     <w:p>
@@ -3783,7 +6920,7 @@
           <w:rFonts w:ascii="Segoe UI" w:hAnsi="Segoe UI"/>
           <w:color w:val="1E9ED5"/>
         </w:rPr>
-        <w:t>3.2  Spreadsheet-Style Inline Editing</w:t>
+        <w:t>4.2  Spreadsheet-Style Inline Editing</w:t>
       </w:r>
     </w:p>
     <w:p>
@@ -3866,7 +7003,7 @@
           <w:rFonts w:ascii="Segoe UI" w:hAnsi="Segoe UI"/>
           <w:color w:val="1E9ED5"/>
         </w:rPr>
-        <w:t>3.3  Task Status Lifecycle</w:t>
+        <w:t>4.3  Task Status Lifecycle</w:t>
       </w:r>
     </w:p>
     <w:p>
@@ -4598,7 +7735,7 @@
           <w:rFonts w:ascii="Segoe UI" w:hAnsi="Segoe UI"/>
           <w:color w:val="1E9ED5"/>
         </w:rPr>
-        <w:t>3.4  Column Management &amp; Visibility</w:t>
+        <w:t>4.4  Column Management &amp; Visibility</w:t>
       </w:r>
     </w:p>
     <w:p>
@@ -4667,7 +7804,7 @@
           <w:rFonts w:ascii="Segoe UI" w:hAnsi="Segoe UI"/>
           <w:color w:val="1E9ED5"/>
         </w:rPr>
-        <w:t>3.5  Complexity &amp; Effort Estimation</w:t>
+        <w:t>4.5  Complexity &amp; Effort Estimation</w:t>
       </w:r>
     </w:p>
     <w:p>
@@ -5167,7 +8304,7 @@
           <w:rFonts w:ascii="Segoe UI" w:hAnsi="Segoe UI"/>
           <w:color w:val="1E9ED5"/>
         </w:rPr>
-        <w:t>3.6  Filtering &amp; Sorting</w:t>
+        <w:t>4.6  Filtering &amp; Sorting</w:t>
       </w:r>
     </w:p>
     <w:p>
@@ -5255,7 +8392,7 @@
           <w:rFonts w:ascii="Segoe UI" w:hAnsi="Segoe UI"/>
           <w:color w:val="0D1B2A"/>
         </w:rPr>
-        <w:t>4  Gantt Timeline &amp; Dependency Management</w:t>
+        <w:t>5  Gantt Timeline &amp; Dependency Management</w:t>
       </w:r>
     </w:p>
     <w:p>
@@ -5308,7 +8445,7 @@
               <w:drawing>
                 <wp:inline xmlns:a="http://schemas.openxmlformats.org/drawingml/2006/main" xmlns:pic="http://schemas.openxmlformats.org/drawingml/2006/picture">
                   <wp:extent cx="5577840" cy="3137535"/>
-                  <wp:docPr id="3" name="Picture 3"/>
+                  <wp:docPr id="6" name="Picture 6"/>
                   <wp:cNvGraphicFramePr>
                     <a:graphicFrameLocks noChangeAspect="1"/>
                   </wp:cNvGraphicFramePr>
@@ -5320,7 +8457,7 @@
                           <pic:cNvPicPr/>
                         </pic:nvPicPr>
                         <pic:blipFill>
-                          <a:blip r:embed="rId11"/>
+                          <a:blip r:embed="rId14"/>
                           <a:stretch>
                             <a:fillRect/>
                           </a:stretch>
@@ -5354,7 +8491,7 @@
           <w:color w:val="6C757D"/>
           <w:sz w:val="18"/>
         </w:rPr>
-        <w:t>Figure 4.1 — Gantt Timeline with dependency arrows, critical path highlighting, and baseline comparison overlay</w:t>
+        <w:t>Figure 5.1 — Gantt Timeline with dependency arrows, critical path highlighting, and baseline comparison overlay</w:t>
       </w:r>
     </w:p>
     <w:p>
@@ -5368,7 +8505,7 @@
           <w:rFonts w:ascii="Segoe UI" w:hAnsi="Segoe UI"/>
           <w:color w:val="1E9ED5"/>
         </w:rPr>
-        <w:t>4.1  Timeline Controls</w:t>
+        <w:t>5.1  Timeline Controls</w:t>
       </w:r>
     </w:p>
     <w:p>
@@ -5451,7 +8588,7 @@
           <w:rFonts w:ascii="Segoe UI" w:hAnsi="Segoe UI"/>
           <w:color w:val="1E9ED5"/>
         </w:rPr>
-        <w:t>4.2  Dependency Arrows</w:t>
+        <w:t>5.2  Dependency Arrows</w:t>
       </w:r>
     </w:p>
     <w:p>
@@ -5520,7 +8657,7 @@
           <w:rFonts w:ascii="Segoe UI" w:hAnsi="Segoe UI"/>
           <w:color w:val="1E9ED5"/>
         </w:rPr>
-        <w:t>4.3  Drag-to-Reschedule</w:t>
+        <w:t>5.3  Drag-to-Reschedule</w:t>
       </w:r>
     </w:p>
     <w:p>
@@ -5656,7 +8793,7 @@
           <w:rFonts w:ascii="Segoe UI" w:hAnsi="Segoe UI"/>
           <w:color w:val="0D1B2A"/>
         </w:rPr>
-        <w:t>5  Intelligent Weekly Scheduler &amp; Conflict Resolver</w:t>
+        <w:t>6  Intelligent Weekly Scheduler &amp; Conflict Resolver</w:t>
       </w:r>
     </w:p>
     <w:p>
@@ -5709,7 +8846,7 @@
               <w:drawing>
                 <wp:inline xmlns:a="http://schemas.openxmlformats.org/drawingml/2006/main" xmlns:pic="http://schemas.openxmlformats.org/drawingml/2006/picture">
                   <wp:extent cx="5577840" cy="3137535"/>
-                  <wp:docPr id="4" name="Picture 4"/>
+                  <wp:docPr id="7" name="Picture 7"/>
                   <wp:cNvGraphicFramePr>
                     <a:graphicFrameLocks noChangeAspect="1"/>
                   </wp:cNvGraphicFramePr>
@@ -5721,7 +8858,7 @@
                           <pic:cNvPicPr/>
                         </pic:nvPicPr>
                         <pic:blipFill>
-                          <a:blip r:embed="rId12"/>
+                          <a:blip r:embed="rId15"/>
                           <a:stretch>
                             <a:fillRect/>
                           </a:stretch>
@@ -5755,7 +8892,7 @@
           <w:color w:val="6C757D"/>
           <w:sz w:val="18"/>
         </w:rPr>
-        <w:t>Figure 5.1 — Weekly Scheduler: Resource Heatmap Grid, Conflict Diagnostics, and Copilot Cockpit</w:t>
+        <w:t>Figure 6.1 — Weekly Scheduler: Resource Heatmap Grid, Conflict Diagnostics, and Copilot Cockpit</w:t>
       </w:r>
     </w:p>
     <w:p>
@@ -5769,7 +8906,7 @@
           <w:rFonts w:ascii="Segoe UI" w:hAnsi="Segoe UI"/>
           <w:color w:val="1E9ED5"/>
         </w:rPr>
-        <w:t>5.1  The Weekly Heatmap Grid</w:t>
+        <w:t>6.1  The Weekly Heatmap Grid</w:t>
       </w:r>
     </w:p>
     <w:p>
@@ -6467,7 +9604,7 @@
           <w:rFonts w:ascii="Segoe UI" w:hAnsi="Segoe UI"/>
           <w:color w:val="1E9ED5"/>
         </w:rPr>
-        <w:t>5.2  Left Navigation Sidebar</w:t>
+        <w:t>6.2  Left Navigation Sidebar</w:t>
       </w:r>
     </w:p>
     <w:p>
@@ -6550,7 +9687,7 @@
           <w:rFonts w:ascii="Segoe UI" w:hAnsi="Segoe UI"/>
           <w:color w:val="1E9ED5"/>
         </w:rPr>
-        <w:t>5.3  Right-Side Diagnostics Cockpit</w:t>
+        <w:t>6.3  Right-Side Diagnostics Cockpit</w:t>
       </w:r>
     </w:p>
     <w:p>
@@ -6619,7 +9756,7 @@
           <w:rFonts w:ascii="Segoe UI" w:hAnsi="Segoe UI"/>
           <w:color w:val="1E9ED5"/>
         </w:rPr>
-        <w:t>5.4  Automated Conflict Resolution Heuristics</w:t>
+        <w:t>6.4  Automated Conflict Resolution Heuristics</w:t>
       </w:r>
     </w:p>
     <w:p>
@@ -7249,7 +10386,7 @@
           <w:rFonts w:ascii="Segoe UI" w:hAnsi="Segoe UI"/>
           <w:color w:val="1E9ED5"/>
         </w:rPr>
-        <w:t>5.5  Interactive Tooltips</w:t>
+        <w:t>6.5  Interactive Tooltips</w:t>
       </w:r>
     </w:p>
     <w:p>
@@ -7309,7 +10446,7 @@
           <w:rFonts w:ascii="Segoe UI" w:hAnsi="Segoe UI"/>
           <w:color w:val="0D1B2A"/>
         </w:rPr>
-        <w:t>6  Unified RAID Register</w:t>
+        <w:t>7  Unified RAID Register</w:t>
       </w:r>
     </w:p>
     <w:p>
@@ -7362,7 +10499,7 @@
               <w:drawing>
                 <wp:inline xmlns:a="http://schemas.openxmlformats.org/drawingml/2006/main" xmlns:pic="http://schemas.openxmlformats.org/drawingml/2006/picture">
                   <wp:extent cx="5577840" cy="3137535"/>
-                  <wp:docPr id="5" name="Picture 5"/>
+                  <wp:docPr id="8" name="Picture 8"/>
                   <wp:cNvGraphicFramePr>
                     <a:graphicFrameLocks noChangeAspect="1"/>
                   </wp:cNvGraphicFramePr>
@@ -7370,11 +10507,11 @@
                     <a:graphicData uri="http://schemas.openxmlformats.org/drawingml/2006/picture">
                       <pic:pic>
                         <pic:nvPicPr>
-                          <pic:cNvPr id="0" name="05_raid_register.png"/>
+                          <pic:cNvPr id="0" name="04_weekly_scheduler.png"/>
                           <pic:cNvPicPr/>
                         </pic:nvPicPr>
                         <pic:blipFill>
-                          <a:blip r:embed="rId13"/>
+                          <a:blip r:embed="rId15"/>
                           <a:stretch>
                             <a:fillRect/>
                           </a:stretch>
@@ -7408,7 +10545,7 @@
           <w:color w:val="6C757D"/>
           <w:sz w:val="18"/>
         </w:rPr>
-        <w:t>Figure 6.1 — Unified RAID Register with 5×5 Risk Matrix Heatmap and categorised RAID items</w:t>
+        <w:t>Figure 7.1 — Unified RAID Register with 5×5 Risk Matrix Heatmap and categorised RAID items</w:t>
       </w:r>
     </w:p>
     <w:p>
@@ -7422,7 +10559,7 @@
           <w:rFonts w:ascii="Segoe UI" w:hAnsi="Segoe UI"/>
           <w:color w:val="1E9ED5"/>
         </w:rPr>
-        <w:t>6.1  RAID Classification Model</w:t>
+        <w:t>7.1  RAID Classification Model</w:t>
       </w:r>
     </w:p>
     <w:p>
@@ -7958,7 +11095,7 @@
           <w:rFonts w:ascii="Segoe UI" w:hAnsi="Segoe UI"/>
           <w:color w:val="1E9ED5"/>
         </w:rPr>
-        <w:t>6.2  Threat Exposure Scoring</w:t>
+        <w:t>7.2  Threat Exposure Scoring</w:t>
       </w:r>
     </w:p>
     <w:p>
@@ -8539,7 +11676,7 @@
           <w:rFonts w:ascii="Segoe UI" w:hAnsi="Segoe UI"/>
           <w:color w:val="1E9ED5"/>
         </w:rPr>
-        <w:t>6.3  RAID Item Lifecycle</w:t>
+        <w:t>7.3  RAID Item Lifecycle</w:t>
       </w:r>
     </w:p>
     <w:p>
@@ -8636,7 +11773,7 @@
           <w:rFonts w:ascii="Segoe UI" w:hAnsi="Segoe UI"/>
           <w:color w:val="1E9ED5"/>
         </w:rPr>
-        <w:t>6.4  Required Fields for Active RAID Items</w:t>
+        <w:t>7.4  Required Fields for Active RAID Items</w:t>
       </w:r>
     </w:p>
     <w:p>
@@ -8769,7 +11906,7 @@
           <w:rFonts w:ascii="Segoe UI" w:hAnsi="Segoe UI"/>
           <w:color w:val="0D1B2A"/>
         </w:rPr>
-        <w:t>7  Team Capacity Hub &amp; Role Management</w:t>
+        <w:t>8  Team Capacity Hub &amp; Role Management</w:t>
       </w:r>
     </w:p>
     <w:p>
@@ -8822,7 +11959,7 @@
               <w:drawing>
                 <wp:inline xmlns:a="http://schemas.openxmlformats.org/drawingml/2006/main" xmlns:pic="http://schemas.openxmlformats.org/drawingml/2006/picture">
                   <wp:extent cx="5577840" cy="3137535"/>
-                  <wp:docPr id="6" name="Picture 6"/>
+                  <wp:docPr id="9" name="Picture 9"/>
                   <wp:cNvGraphicFramePr>
                     <a:graphicFrameLocks noChangeAspect="1"/>
                   </wp:cNvGraphicFramePr>
@@ -8834,7 +11971,7 @@
                           <pic:cNvPicPr/>
                         </pic:nvPicPr>
                         <pic:blipFill>
-                          <a:blip r:embed="rId14"/>
+                          <a:blip r:embed="rId16"/>
                           <a:stretch>
                             <a:fillRect/>
                           </a:stretch>
@@ -8868,7 +12005,7 @@
           <w:color w:val="6C757D"/>
           <w:sz w:val="18"/>
         </w:rPr>
-        <w:t>Figure 7.1 — Team Capacity Hub: Member profiles, utilisation bars, and leave calendar integration</w:t>
+        <w:t>Figure 8.1 — Team Capacity Hub: Member profiles, utilisation bars, and leave calendar integration</w:t>
       </w:r>
     </w:p>
     <w:p>
@@ -8882,7 +12019,7 @@
           <w:rFonts w:ascii="Segoe UI" w:hAnsi="Segoe UI"/>
           <w:color w:val="1E9ED5"/>
         </w:rPr>
-        <w:t>7.1  Adding and Managing Team Members</w:t>
+        <w:t>8.1  Adding and Managing Team Members</w:t>
       </w:r>
     </w:p>
     <w:p>
@@ -8974,7 +12111,7 @@
           <w:rFonts w:ascii="Segoe UI" w:hAnsi="Segoe UI"/>
           <w:color w:val="1E9ED5"/>
         </w:rPr>
-        <w:t>7.2  Capacity Parameters</w:t>
+        <w:t>8.2  Capacity Parameters</w:t>
       </w:r>
     </w:p>
     <w:p>
@@ -9510,7 +12647,7 @@
           <w:rFonts w:ascii="Segoe UI" w:hAnsi="Segoe UI"/>
           <w:color w:val="1E9ED5"/>
         </w:rPr>
-        <w:t>7.3  Dynamic Workload Balancing</w:t>
+        <w:t>8.3  Dynamic Workload Balancing</w:t>
       </w:r>
     </w:p>
     <w:p>
@@ -9579,7 +12716,7 @@
           <w:rFonts w:ascii="Segoe UI" w:hAnsi="Segoe UI"/>
           <w:color w:val="1E9ED5"/>
         </w:rPr>
-        <w:t>7.4  Role-Based Assignment Logic</w:t>
+        <w:t>8.4  Role-Based Assignment Logic</w:t>
       </w:r>
     </w:p>
     <w:p>
@@ -10222,7 +13359,7 @@
           <w:rFonts w:ascii="Segoe UI" w:hAnsi="Segoe UI"/>
           <w:color w:val="0D1B2A"/>
         </w:rPr>
-        <w:t>8  Defect Tracker &amp; Bug Lifecycle</w:t>
+        <w:t>9  Defect Tracker &amp; Bug Lifecycle</w:t>
       </w:r>
     </w:p>
     <w:p>
@@ -10275,7 +13412,7 @@
               <w:drawing>
                 <wp:inline xmlns:a="http://schemas.openxmlformats.org/drawingml/2006/main" xmlns:pic="http://schemas.openxmlformats.org/drawingml/2006/picture">
                   <wp:extent cx="5577840" cy="3137535"/>
-                  <wp:docPr id="7" name="Picture 7"/>
+                  <wp:docPr id="10" name="Picture 10"/>
                   <wp:cNvGraphicFramePr>
                     <a:graphicFrameLocks noChangeAspect="1"/>
                   </wp:cNvGraphicFramePr>
@@ -10287,7 +13424,7 @@
                           <pic:cNvPicPr/>
                         </pic:nvPicPr>
                         <pic:blipFill>
-                          <a:blip r:embed="rId15"/>
+                          <a:blip r:embed="rId17"/>
                           <a:stretch>
                             <a:fillRect/>
                           </a:stretch>
@@ -10321,7 +13458,7 @@
           <w:color w:val="6C757D"/>
           <w:sz w:val="18"/>
         </w:rPr>
-        <w:t>Figure 8.1 — Defect Tracker: Summary cards, severity-coded defect table, and bug lifecycle diagram</w:t>
+        <w:t>Figure 9.1 — Defect Tracker: Summary cards, severity-coded defect table, and bug lifecycle diagram</w:t>
       </w:r>
     </w:p>
     <w:p>
@@ -10335,7 +13472,7 @@
           <w:rFonts w:ascii="Segoe UI" w:hAnsi="Segoe UI"/>
           <w:color w:val="1E9ED5"/>
         </w:rPr>
-        <w:t>8.1  Defect Severity Matrix</w:t>
+        <w:t>9.1  Defect Severity Matrix</w:t>
       </w:r>
     </w:p>
     <w:p>
@@ -11195,7 +14332,7 @@
           <w:rFonts w:ascii="Segoe UI" w:hAnsi="Segoe UI"/>
           <w:color w:val="1E9ED5"/>
         </w:rPr>
-        <w:t>8.2  Bug Lifecycle &amp; Status Workflow</w:t>
+        <w:t>9.2  Bug Lifecycle &amp; Status Workflow</w:t>
       </w:r>
     </w:p>
     <w:p>
@@ -12025,7 +15162,7 @@
           <w:rFonts w:ascii="Segoe UI" w:hAnsi="Segoe UI"/>
           <w:color w:val="1E9ED5"/>
         </w:rPr>
-        <w:t>8.3  Linking Defects to Tasks</w:t>
+        <w:t>9.3  Linking Defects to Tasks</w:t>
       </w:r>
     </w:p>
     <w:p>
@@ -12108,7 +15245,7 @@
           <w:rFonts w:ascii="Segoe UI" w:hAnsi="Segoe UI"/>
           <w:color w:val="1E9ED5"/>
         </w:rPr>
-        <w:t>8.4  Logging a New Defect — Step by Step</w:t>
+        <w:t>9.4  Logging a New Defect — Step by Step</w:t>
       </w:r>
     </w:p>
     <w:p>
@@ -12255,7 +15392,7 @@
           <w:rFonts w:ascii="Segoe UI" w:hAnsi="Segoe UI"/>
           <w:color w:val="0D1B2A"/>
         </w:rPr>
-        <w:t>9  Reports &amp; Stakeholder Board Packs</w:t>
+        <w:t>10  Reports &amp; Stakeholder Board Packs</w:t>
       </w:r>
     </w:p>
     <w:p>
@@ -12308,7 +15445,7 @@
               <w:drawing>
                 <wp:inline xmlns:a="http://schemas.openxmlformats.org/drawingml/2006/main" xmlns:pic="http://schemas.openxmlformats.org/drawingml/2006/picture">
                   <wp:extent cx="5577840" cy="3137535"/>
-                  <wp:docPr id="8" name="Picture 8"/>
+                  <wp:docPr id="11" name="Picture 11"/>
                   <wp:cNvGraphicFramePr>
                     <a:graphicFrameLocks noChangeAspect="1"/>
                   </wp:cNvGraphicFramePr>
@@ -12320,7 +15457,7 @@
                           <pic:cNvPicPr/>
                         </pic:nvPicPr>
                         <pic:blipFill>
-                          <a:blip r:embed="rId16"/>
+                          <a:blip r:embed="rId18"/>
                           <a:stretch>
                             <a:fillRect/>
                           </a:stretch>
@@ -12354,7 +15491,7 @@
           <w:color w:val="6C757D"/>
           <w:sz w:val="18"/>
         </w:rPr>
-        <w:t>Figure 9.1 — Reports &amp; Board Packs: Report builder, export controls, and preview panel</w:t>
+        <w:t>Figure 10.1 — Reports &amp; Board Packs: Report builder, export controls, and preview panel</w:t>
       </w:r>
     </w:p>
     <w:p>
@@ -12368,7 +15505,7 @@
           <w:rFonts w:ascii="Segoe UI" w:hAnsi="Segoe UI"/>
           <w:color w:val="1E9ED5"/>
         </w:rPr>
-        <w:t>9.1  Executive Board Pack</w:t>
+        <w:t>10.1  Executive Board Pack</w:t>
       </w:r>
     </w:p>
     <w:p>
@@ -12465,7 +15602,7 @@
           <w:rFonts w:ascii="Segoe UI" w:hAnsi="Segoe UI"/>
           <w:color w:val="1E9ED5"/>
         </w:rPr>
-        <w:t>9.2  Excel Workbook Export</w:t>
+        <w:t>10.2  Excel Workbook Export</w:t>
       </w:r>
     </w:p>
     <w:p>
@@ -13103,7 +16240,7 @@
           <w:rFonts w:ascii="Segoe UI" w:hAnsi="Segoe UI"/>
           <w:color w:val="1E9ED5"/>
         </w:rPr>
-        <w:t>9.3  Excel Cell Colour Coding</w:t>
+        <w:t>10.3  Excel Cell Colour Coding</w:t>
       </w:r>
     </w:p>
     <w:p>
@@ -13706,7 +16843,7 @@
           <w:rFonts w:ascii="Segoe UI" w:hAnsi="Segoe UI"/>
           <w:color w:val="0D1B2A"/>
         </w:rPr>
-        <w:t>10  Audit Log &amp; Activity Streams</w:t>
+        <w:t>11  Audit Log &amp; Activity Streams</w:t>
       </w:r>
     </w:p>
     <w:p>
@@ -13759,7 +16896,7 @@
               <w:drawing>
                 <wp:inline xmlns:a="http://schemas.openxmlformats.org/drawingml/2006/main" xmlns:pic="http://schemas.openxmlformats.org/drawingml/2006/picture">
                   <wp:extent cx="5577840" cy="3137535"/>
-                  <wp:docPr id="9" name="Picture 9"/>
+                  <wp:docPr id="12" name="Picture 12"/>
                   <wp:cNvGraphicFramePr>
                     <a:graphicFrameLocks noChangeAspect="1"/>
                   </wp:cNvGraphicFramePr>
@@ -13771,7 +16908,7 @@
                           <pic:cNvPicPr/>
                         </pic:nvPicPr>
                         <pic:blipFill>
-                          <a:blip r:embed="rId17"/>
+                          <a:blip r:embed="rId19"/>
                           <a:stretch>
                             <a:fillRect/>
                           </a:stretch>
@@ -13805,7 +16942,7 @@
           <w:color w:val="6C757D"/>
           <w:sz w:val="18"/>
         </w:rPr>
-        <w:t>Figure 10.1 — Audit Log: Chronological activity stream with user identifiers and diff payloads</w:t>
+        <w:t>Figure 11.1 — Audit Log: Chronological activity stream with user identifiers and diff payloads</w:t>
       </w:r>
     </w:p>
     <w:p>
@@ -13819,7 +16956,7 @@
           <w:rFonts w:ascii="Segoe UI" w:hAnsi="Segoe UI"/>
           <w:color w:val="1E9ED5"/>
         </w:rPr>
-        <w:t>10.1  What Gets Logged</w:t>
+        <w:t>11.1  What Gets Logged</w:t>
       </w:r>
     </w:p>
     <w:p>
@@ -14355,7 +17492,7 @@
           <w:rFonts w:ascii="Segoe UI" w:hAnsi="Segoe UI"/>
           <w:color w:val="1E9ED5"/>
         </w:rPr>
-        <w:t>10.2  Log Entry Structure</w:t>
+        <w:t>11.2  Log Entry Structure</w:t>
       </w:r>
     </w:p>
     <w:p>
@@ -14494,7 +17631,7 @@
           <w:rFonts w:ascii="Segoe UI" w:hAnsi="Segoe UI"/>
           <w:color w:val="1E9ED5"/>
         </w:rPr>
-        <w:t>10.3  Retrospective Activity Date Resolution</w:t>
+        <w:t>11.3  Retrospective Activity Date Resolution</w:t>
       </w:r>
     </w:p>
     <w:p>
@@ -14520,7 +17657,7 @@
           <w:rFonts w:ascii="Segoe UI" w:hAnsi="Segoe UI"/>
           <w:color w:val="1E9ED5"/>
         </w:rPr>
-        <w:t>10.4  State Reconstruction</w:t>
+        <w:t>11.4  State Reconstruction</w:t>
       </w:r>
     </w:p>
     <w:p>
@@ -14678,7 +17815,7 @@
           <w:rFonts w:ascii="Segoe UI" w:hAnsi="Segoe UI"/>
           <w:color w:val="0D1B2A"/>
         </w:rPr>
-        <w:t>11  Schedule Baselines &amp; Snapshot History</w:t>
+        <w:t>12  Schedule Baselines &amp; Snapshot History</w:t>
       </w:r>
     </w:p>
     <w:p>
@@ -14731,7 +17868,7 @@
               <w:drawing>
                 <wp:inline xmlns:a="http://schemas.openxmlformats.org/drawingml/2006/main" xmlns:pic="http://schemas.openxmlformats.org/drawingml/2006/picture">
                   <wp:extent cx="5577840" cy="3137535"/>
-                  <wp:docPr id="10" name="Picture 10"/>
+                  <wp:docPr id="13" name="Picture 13"/>
                   <wp:cNvGraphicFramePr>
                     <a:graphicFrameLocks noChangeAspect="1"/>
                   </wp:cNvGraphicFramePr>
@@ -14743,7 +17880,7 @@
                           <pic:cNvPicPr/>
                         </pic:nvPicPr>
                         <pic:blipFill>
-                          <a:blip r:embed="rId18"/>
+                          <a:blip r:embed="rId20"/>
                           <a:stretch>
                             <a:fillRect/>
                           </a:stretch>
@@ -14777,7 +17914,7 @@
           <w:color w:val="6C757D"/>
           <w:sz w:val="18"/>
         </w:rPr>
-        <w:t>Figure 11.1 — Schedule Baselines &amp; Snapshot History panel in Project Settings</w:t>
+        <w:t>Figure 12.1 — Schedule Baselines &amp; Snapshot History panel in Project Settings</w:t>
       </w:r>
     </w:p>
     <w:p>
@@ -14791,7 +17928,7 @@
           <w:rFonts w:ascii="Segoe UI" w:hAnsi="Segoe UI"/>
           <w:color w:val="1E9ED5"/>
         </w:rPr>
-        <w:t>11.1  Three Date Sets Explained</w:t>
+        <w:t>12.1  Three Date Sets Explained</w:t>
       </w:r>
     </w:p>
     <w:p>
@@ -15229,7 +18366,7 @@
           <w:rFonts w:ascii="Segoe UI" w:hAnsi="Segoe UI"/>
           <w:color w:val="1E9ED5"/>
         </w:rPr>
-        <w:t>11.2  Capturing a Baseline Snapshot</w:t>
+        <w:t>12.2  Capturing a Baseline Snapshot</w:t>
       </w:r>
     </w:p>
     <w:p>
@@ -15352,7 +18489,7 @@
           <w:rFonts w:ascii="Segoe UI" w:hAnsi="Segoe UI"/>
           <w:color w:val="1E9ED5"/>
         </w:rPr>
-        <w:t>11.3  Variance &amp; Slippage Analysis</w:t>
+        <w:t>12.3  Variance &amp; Slippage Analysis</w:t>
       </w:r>
     </w:p>
     <w:p>
@@ -15790,7 +18927,7 @@
           <w:rFonts w:ascii="Segoe UI" w:hAnsi="Segoe UI"/>
           <w:color w:val="1E9ED5"/>
         </w:rPr>
-        <w:t>11.4  Restoring a Baseline</w:t>
+        <w:t>12.4  Restoring a Baseline</w:t>
       </w:r>
     </w:p>
     <w:p>
@@ -15926,7 +19063,7 @@
           <w:rFonts w:ascii="Segoe UI" w:hAnsi="Segoe UI"/>
           <w:color w:val="0D1B2A"/>
         </w:rPr>
-        <w:t>12  System Configuration Reference</w:t>
+        <w:t>13  System Configuration Reference</w:t>
       </w:r>
     </w:p>
     <w:p>
@@ -15979,7 +19116,7 @@
               <w:drawing>
                 <wp:inline xmlns:a="http://schemas.openxmlformats.org/drawingml/2006/main" xmlns:pic="http://schemas.openxmlformats.org/drawingml/2006/picture">
                   <wp:extent cx="5577840" cy="3137535"/>
-                  <wp:docPr id="11" name="Picture 11"/>
+                  <wp:docPr id="14" name="Picture 14"/>
                   <wp:cNvGraphicFramePr>
                     <a:graphicFrameLocks noChangeAspect="1"/>
                   </wp:cNvGraphicFramePr>
@@ -15991,7 +19128,7 @@
                           <pic:cNvPicPr/>
                         </pic:nvPicPr>
                         <pic:blipFill>
-                          <a:blip r:embed="rId18"/>
+                          <a:blip r:embed="rId20"/>
                           <a:stretch>
                             <a:fillRect/>
                           </a:stretch>
@@ -16025,7 +19162,7 @@
           <w:color w:val="6C757D"/>
           <w:sz w:val="18"/>
         </w:rPr>
-        <w:t>Figure 12.1 — System Configuration: General Settings, Dropdown Manager, and Custom Fields panel</w:t>
+        <w:t>Figure 13.1 — System Configuration: General Settings, Dropdown Manager, and Custom Fields panel</w:t>
       </w:r>
     </w:p>
     <w:p>
@@ -16039,7 +19176,7 @@
           <w:rFonts w:ascii="Segoe UI" w:hAnsi="Segoe UI"/>
           <w:color w:val="1E9ED5"/>
         </w:rPr>
-        <w:t>12.1  General Settings</w:t>
+        <w:t>13.1  General Settings</w:t>
       </w:r>
     </w:p>
     <w:p>
@@ -16673,7 +19810,7 @@
           <w:rFonts w:ascii="Segoe UI" w:hAnsi="Segoe UI"/>
           <w:color w:val="1E9ED5"/>
         </w:rPr>
-        <w:t>12.2  Dropdown Configuration Manager</w:t>
+        <w:t>13.2  Dropdown Configuration Manager</w:t>
       </w:r>
     </w:p>
     <w:p>
@@ -16814,7 +19951,7 @@
           <w:rFonts w:ascii="Segoe UI" w:hAnsi="Segoe UI"/>
           <w:color w:val="1E9ED5"/>
         </w:rPr>
-        <w:t>12.3  Custom Fields</w:t>
+        <w:t>13.3  Custom Fields</w:t>
       </w:r>
     </w:p>
     <w:p>
@@ -16897,7 +20034,7 @@
           <w:rFonts w:ascii="Segoe UI" w:hAnsi="Segoe UI"/>
           <w:color w:val="1E9ED5"/>
         </w:rPr>
-        <w:t>12.4  Complexity Factor Multipliers</w:t>
+        <w:t>13.4  Complexity Factor Multipliers</w:t>
       </w:r>
     </w:p>
     <w:p>
@@ -16923,7 +20060,7 @@
           <w:rFonts w:ascii="Segoe UI" w:hAnsi="Segoe UI"/>
           <w:color w:val="1E9ED5"/>
         </w:rPr>
-        <w:t>12.5  Theme &amp; Visual Configuration</w:t>
+        <w:t>13.5  Theme &amp; Visual Configuration</w:t>
       </w:r>
     </w:p>
     <w:p>

</xml_diff>